<commit_message>
Update employee name fields and location details in the template
Update SF330 Section E template to use separate employee first, middle, and last name placeholders and include city/state in the firm location.

Replit-Commit-Author: Agent
Replit-Commit-Session-Id: 1ec8bf30-b550-4906-bcd3-e544e1e1b5dc
Replit-Commit-Checkpoint-Type: intermediate_checkpoint
Replit-Commit-Event-Id: 38bf7930-e0a2-407e-9873-1449be4de56b
Replit-Commit-Screenshot-Url: https://storage.googleapis.com/screenshot-production-us-central1/af2874c8-850c-400e-9904-a383accec6ca/1ec8bf30-b550-4906-bcd3-e544e1e1b5dc/ikF0b3E
Replit-Helium-Checkpoint-Created: true
</commit_message>
<xml_diff>
--- a/attached_assets/sf330_section_e_template.docx
+++ b/attached_assets/sf330_section_e_template.docx
@@ -199,7 +199,7 @@
                 <w:sz w:val="18"/>
                 <w:szCs w:val="18"/>
               </w:rPr>
-              <w:t>{{EMPLOYEE_NAME}}</w:t>
+              <w:t>{{EMPLOYEE_LAST_NAME}}, {{EMPLOYEE_FIRST_NAME}} {{EMPLOYEE_MIDDLE_NAME}}</w:t>
             </w:r>
           </w:p>
         </w:tc>
@@ -407,7 +407,7 @@
                 <w:sz w:val="18"/>
                 <w:szCs w:val="18"/>
               </w:rPr>
-              <w:t>{{FIRM_CITY}}, {{FIRM_STATE}}</w:t>
+              <w:t>{{EMPLOYEE_CITY}}, {{EMPLOYEE_STATE}}</w:t>
             </w:r>
           </w:p>
         </w:tc>

</xml_diff>

<commit_message>
Update the default SF330 resume template for proposals
Replace the existing default SF330 Section E resume template file with the new attached version.

Replit-Commit-Author: Agent
Replit-Commit-Session-Id: 7b7d5aea-535d-4f8f-9c25-a0db79855651
Replit-Commit-Checkpoint-Type: full_checkpoint
Replit-Commit-Event-Id: 074f240a-94b6-4d9d-b2d6-cf7bc5331be6
Replit-Helium-Checkpoint-Created: true
</commit_message>
<xml_diff>
--- a/attached_assets/sf330_section_e_template.docx
+++ b/attached_assets/sf330_section_e_template.docx
@@ -34,7 +34,7 @@
               <w:bottom w:val="nil"/>
               <w:right w:val="nil"/>
             </w:tcBorders>
-            <w:shd w:val="clear" w:color="auto" w:fill="EE0000"/>
+            <w:shd w:val="clear" w:color="auto" w:fill="CF3910"/>
             <w:tcMar>
               <w:top w:w="0" w:type="dxa"/>
               <w:left w:w="120" w:type="dxa"/>
@@ -188,18 +188,40 @@
             <w:pPr>
               <w:pStyle w:val="Heading2"/>
               <w:rPr>
-                <w:rFonts w:ascii="Times New Roman" w:hAnsi="Times New Roman" w:cs="Times New Roman"/>
-              </w:rPr>
-            </w:pPr>
-            <w:r>
-              <w:rPr>
-                <w:rFonts w:ascii="Times New Roman" w:hAnsi="Times New Roman" w:cs="Times New Roman"/>
+                <w:rFonts w:ascii="Arial Narrow" w:hAnsi="Arial Narrow" w:cs="Times New Roman"/>
+              </w:rPr>
+            </w:pPr>
+            <w:r>
+              <w:rPr>
+                <w:rFonts w:ascii="Arial Narrow" w:hAnsi="Arial Narrow" w:cs="Times New Roman"/>
                 <w:i w:val="0"/>
                 <w:iCs w:val="0"/>
                 <w:sz w:val="18"/>
                 <w:szCs w:val="18"/>
               </w:rPr>
-              <w:t>{{EMPLOYEE_LAST_NAME}}, {{EMPLOYEE_FIRST_NAME}} {{EMPLOYEE_MIDDLE_NAME}}</w:t>
+              <w:t>{{EMPLOYEE_LAST_</w:t>
+            </w:r>
+            <w:proofErr w:type="gramStart"/>
+            <w:r>
+              <w:rPr>
+                <w:rFonts w:ascii="Arial Narrow" w:hAnsi="Arial Narrow" w:cs="Times New Roman"/>
+                <w:i w:val="0"/>
+                <w:iCs w:val="0"/>
+                <w:sz w:val="18"/>
+                <w:szCs w:val="18"/>
+              </w:rPr>
+              <w:t>NAME}}, {{</w:t>
+            </w:r>
+            <w:proofErr w:type="gramEnd"/>
+            <w:r>
+              <w:rPr>
+                <w:rFonts w:ascii="Arial Narrow" w:hAnsi="Arial Narrow" w:cs="Times New Roman"/>
+                <w:i w:val="0"/>
+                <w:iCs w:val="0"/>
+                <w:sz w:val="18"/>
+                <w:szCs w:val="18"/>
+              </w:rPr>
+              <w:t>EMPLOYEE_FIRST_NAME}} {{EMPLOYEE_MIDDLE_NAME}}</w:t>
             </w:r>
           </w:p>
         </w:tc>
@@ -222,7 +244,7 @@
           <w:p>
             <w:pPr>
               <w:rPr>
-                <w:rFonts w:ascii="Arial" w:hAnsi="Arial" w:cs="Arial"/>
+                <w:rFonts w:ascii="Arial Narrow" w:hAnsi="Arial Narrow" w:cs="Arial"/>
                 <w:b/>
                 <w:bCs/>
                 <w:sz w:val="18"/>
@@ -238,6 +260,7 @@
             </w:pPr>
             <w:r>
               <w:rPr>
+                <w:rFonts w:ascii="Arial Narrow" w:hAnsi="Arial Narrow"/>
                 <w:b/>
                 <w:iCs/>
                 <w:sz w:val="18"/>
@@ -277,13 +300,15 @@
             <w:pPr>
               <w:jc w:val="center"/>
               <w:rPr>
-                <w:b/>
-                <w:sz w:val="18"/>
-                <w:szCs w:val="18"/>
-              </w:rPr>
-            </w:pPr>
-            <w:r>
-              <w:rPr>
+                <w:rFonts w:ascii="Arial Narrow" w:hAnsi="Arial Narrow"/>
+                <w:b/>
+                <w:sz w:val="18"/>
+                <w:szCs w:val="18"/>
+              </w:rPr>
+            </w:pPr>
+            <w:r>
+              <w:rPr>
+                <w:rFonts w:ascii="Arial Narrow" w:hAnsi="Arial Narrow"/>
                 <w:b/>
                 <w:sz w:val="18"/>
                 <w:szCs w:val="18"/>
@@ -322,13 +347,15 @@
             <w:pPr>
               <w:jc w:val="center"/>
               <w:rPr>
-                <w:b/>
-                <w:sz w:val="18"/>
-                <w:szCs w:val="18"/>
-              </w:rPr>
-            </w:pPr>
-            <w:r>
-              <w:rPr>
+                <w:rFonts w:ascii="Arial" w:hAnsi="Arial" w:cs="Arial"/>
+                <w:b/>
+                <w:sz w:val="18"/>
+                <w:szCs w:val="18"/>
+              </w:rPr>
+            </w:pPr>
+            <w:r>
+              <w:rPr>
+                <w:rFonts w:ascii="Arial" w:hAnsi="Arial" w:cs="Arial"/>
                 <w:b/>
                 <w:sz w:val="18"/>
                 <w:szCs w:val="18"/>
@@ -375,39 +402,83 @@
               <w:pStyle w:val="Heading2"/>
               <w:spacing w:before="0" w:after="0"/>
               <w:rPr>
-                <w:rFonts w:ascii="Times New Roman" w:hAnsi="Times New Roman" w:cs="Times New Roman"/>
+                <w:rFonts w:ascii="Arial Narrow" w:hAnsi="Arial Narrow" w:cs="Times New Roman"/>
                 <w:i w:val="0"/>
               </w:rPr>
             </w:pPr>
             <w:r>
               <w:rPr>
-                <w:rFonts w:ascii="Times New Roman" w:hAnsi="Times New Roman" w:cs="Times New Roman"/>
+                <w:rFonts w:ascii="Arial Narrow" w:hAnsi="Arial Narrow" w:cs="Times New Roman"/>
                 <w:i w:val="0"/>
                 <w:iCs w:val="0"/>
                 <w:sz w:val="18"/>
                 <w:szCs w:val="18"/>
               </w:rPr>
-              <w:t>{{FIRM_NAME}}</w:t>
-            </w:r>
-            <w:r>
-              <w:rPr>
-                <w:rFonts w:ascii="Times New Roman" w:hAnsi="Times New Roman" w:cs="Times New Roman"/>
+              <w:t>{{FIRM_</w:t>
+            </w:r>
+            <w:proofErr w:type="gramStart"/>
+            <w:r>
+              <w:rPr>
+                <w:rFonts w:ascii="Arial Narrow" w:hAnsi="Arial Narrow" w:cs="Times New Roman"/>
                 <w:i w:val="0"/>
                 <w:iCs w:val="0"/>
                 <w:sz w:val="18"/>
                 <w:szCs w:val="18"/>
               </w:rPr>
-              <w:t xml:space="preserve">, </w:t>
-            </w:r>
-            <w:r>
-              <w:rPr>
-                <w:rFonts w:ascii="Times New Roman" w:hAnsi="Times New Roman" w:cs="Times New Roman"/>
+              <w:t>NAME}}</w:t>
+            </w:r>
+            <w:r>
+              <w:rPr>
+                <w:rFonts w:ascii="Arial Narrow" w:hAnsi="Arial Narrow" w:cs="Times New Roman"/>
                 <w:i w:val="0"/>
                 <w:iCs w:val="0"/>
                 <w:sz w:val="18"/>
                 <w:szCs w:val="18"/>
               </w:rPr>
-              <w:t>{{EMPLOYEE_CITY}}, {{EMPLOYEE_STATE}}</w:t>
+              <w:t xml:space="preserve">, </w:t>
+            </w:r>
+            <w:r>
+              <w:rPr>
+                <w:rFonts w:ascii="Arial Narrow" w:hAnsi="Arial Narrow" w:cs="Times New Roman"/>
+                <w:i w:val="0"/>
+                <w:iCs w:val="0"/>
+                <w:sz w:val="18"/>
+                <w:szCs w:val="18"/>
+              </w:rPr>
+              <w:t>{{</w:t>
+            </w:r>
+            <w:proofErr w:type="gramEnd"/>
+            <w:r>
+              <w:rPr>
+                <w:rFonts w:ascii="Arial Narrow" w:hAnsi="Arial Narrow" w:cs="Times New Roman"/>
+                <w:i w:val="0"/>
+                <w:iCs w:val="0"/>
+                <w:sz w:val="18"/>
+                <w:szCs w:val="18"/>
+              </w:rPr>
+              <w:t>EMPLOYEE_</w:t>
+            </w:r>
+            <w:proofErr w:type="gramStart"/>
+            <w:r>
+              <w:rPr>
+                <w:rFonts w:ascii="Arial Narrow" w:hAnsi="Arial Narrow" w:cs="Times New Roman"/>
+                <w:i w:val="0"/>
+                <w:iCs w:val="0"/>
+                <w:sz w:val="18"/>
+                <w:szCs w:val="18"/>
+              </w:rPr>
+              <w:t>CITY}}, {{</w:t>
+            </w:r>
+            <w:proofErr w:type="gramEnd"/>
+            <w:r>
+              <w:rPr>
+                <w:rFonts w:ascii="Arial Narrow" w:hAnsi="Arial Narrow" w:cs="Times New Roman"/>
+                <w:i w:val="0"/>
+                <w:iCs w:val="0"/>
+                <w:sz w:val="18"/>
+                <w:szCs w:val="18"/>
+              </w:rPr>
+              <w:t>EMPLOYEE_STATE}}</w:t>
             </w:r>
           </w:p>
         </w:tc>
@@ -448,12 +519,16 @@
             <w:pPr>
               <w:pStyle w:val="BodyText"/>
               <w:rPr>
-                <w:rFonts w:ascii="Times New Roman" w:hAnsi="Times New Roman" w:cs="Times New Roman"/>
-              </w:rPr>
-            </w:pPr>
-            <w:r>
-              <w:rPr>
-                <w:rFonts w:ascii="Times New Roman" w:hAnsi="Times New Roman" w:cs="Times New Roman"/>
+                <w:rFonts w:ascii="Arial Narrow" w:hAnsi="Arial Narrow" w:cs="Times New Roman"/>
+                <w:b w:val="0"/>
+                <w:bCs w:val="0"/>
+              </w:rPr>
+            </w:pPr>
+            <w:r>
+              <w:rPr>
+                <w:rFonts w:ascii="Arial Narrow" w:hAnsi="Arial Narrow" w:cs="Times New Roman"/>
+                <w:b w:val="0"/>
+                <w:bCs w:val="0"/>
                 <w:iCs/>
               </w:rPr>
               <w:t>{{EDUCATION}}</w:t>
@@ -490,12 +565,14 @@
           <w:p>
             <w:pPr>
               <w:rPr>
-                <w:sz w:val="18"/>
-                <w:szCs w:val="18"/>
-              </w:rPr>
-            </w:pPr>
-            <w:r>
-              <w:rPr>
+                <w:rFonts w:ascii="Arial Narrow" w:hAnsi="Arial Narrow"/>
+                <w:sz w:val="18"/>
+                <w:szCs w:val="18"/>
+              </w:rPr>
+            </w:pPr>
+            <w:r>
+              <w:rPr>
+                <w:rFonts w:ascii="Arial Narrow" w:hAnsi="Arial Narrow"/>
                 <w:sz w:val="18"/>
                 <w:szCs w:val="18"/>
               </w:rPr>
@@ -550,6 +627,7 @@
           <w:p>
             <w:pPr>
               <w:rPr>
+                <w:rFonts w:ascii="Arial Narrow" w:hAnsi="Arial Narrow"/>
                 <w:iCs/>
                 <w:sz w:val="18"/>
                 <w:szCs w:val="18"/>
@@ -557,6 +635,7 @@
             </w:pPr>
             <w:r>
               <w:rPr>
+                <w:rFonts w:ascii="Arial Narrow" w:hAnsi="Arial Narrow"/>
                 <w:iCs/>
                 <w:sz w:val="18"/>
                 <w:szCs w:val="18"/>
@@ -565,6 +644,7 @@
             </w:r>
             <w:r>
               <w:rPr>
+                <w:rFonts w:ascii="Arial Narrow" w:hAnsi="Arial Narrow"/>
                 <w:iCs/>
                 <w:sz w:val="18"/>
                 <w:szCs w:val="18"/>
@@ -573,6 +653,7 @@
             </w:r>
             <w:r>
               <w:rPr>
+                <w:rFonts w:ascii="Arial Narrow" w:hAnsi="Arial Narrow"/>
                 <w:iCs/>
                 <w:sz w:val="18"/>
                 <w:szCs w:val="18"/>
@@ -581,6 +662,7 @@
             </w:r>
             <w:r>
               <w:rPr>
+                <w:rFonts w:ascii="Arial Narrow" w:hAnsi="Arial Narrow"/>
                 <w:iCs/>
                 <w:sz w:val="18"/>
                 <w:szCs w:val="18"/>
@@ -589,19 +671,12 @@
             </w:r>
             <w:r>
               <w:rPr>
+                <w:rFonts w:ascii="Arial Narrow" w:hAnsi="Arial Narrow"/>
                 <w:iCs/>
                 <w:sz w:val="18"/>
                 <w:szCs w:val="18"/>
               </w:rPr>
-              <w:t xml:space="preserve"> | </w:t>
-            </w:r>
-            <w:r>
-              <w:rPr>
-                <w:iCs/>
-                <w:sz w:val="18"/>
-                <w:szCs w:val="18"/>
-              </w:rPr>
-              <w:t>{{OTHER_QUALIFICATIONS}}</w:t>
+              <w:t xml:space="preserve"> | {{OTHER_QUALIFICATIONS}}</w:t>
             </w:r>
           </w:p>
         </w:tc>
@@ -621,7 +696,7 @@
               <w:bottom w:val="nil"/>
               <w:right w:val="nil"/>
             </w:tcBorders>
-            <w:shd w:val="clear" w:color="auto" w:fill="EE0000"/>
+            <w:shd w:val="clear" w:color="auto" w:fill="CF3910"/>
           </w:tcPr>
           <w:p>
             <w:pPr>
@@ -765,6 +840,7 @@
             <w:pPr>
               <w:spacing w:line="105" w:lineRule="atLeast"/>
               <w:rPr>
+                <w:rFonts w:ascii="Arial Narrow" w:hAnsi="Arial Narrow"/>
                 <w:b/>
                 <w:bCs/>
                 <w:sz w:val="18"/>
@@ -773,30 +849,51 @@
             </w:pPr>
             <w:r>
               <w:rPr>
+                <w:rFonts w:ascii="Arial Narrow" w:hAnsi="Arial Narrow"/>
                 <w:b/>
                 <w:bCs/>
                 <w:sz w:val="18"/>
                 <w:szCs w:val="18"/>
               </w:rPr>
-              <w:t>{{PROJECT_EXPERIENCE_1_TITLE}}</w:t>
-            </w:r>
-            <w:r>
-              <w:rPr>
+              <w:t>{{PROJECT_EXPERIENCE_1_</w:t>
+            </w:r>
+            <w:proofErr w:type="gramStart"/>
+            <w:r>
+              <w:rPr>
+                <w:rFonts w:ascii="Arial Narrow" w:hAnsi="Arial Narrow"/>
                 <w:b/>
                 <w:bCs/>
                 <w:sz w:val="18"/>
                 <w:szCs w:val="18"/>
               </w:rPr>
+              <w:t>TITLE}}</w:t>
+            </w:r>
+            <w:r>
+              <w:rPr>
+                <w:rFonts w:ascii="Arial Narrow" w:hAnsi="Arial Narrow"/>
+                <w:b/>
+                <w:bCs/>
+                <w:sz w:val="18"/>
+                <w:szCs w:val="18"/>
+              </w:rPr>
               <w:t xml:space="preserve">, </w:t>
             </w:r>
             <w:r>
               <w:rPr>
-                <w:b/>
-                <w:bCs/>
-                <w:sz w:val="18"/>
-                <w:szCs w:val="18"/>
-              </w:rPr>
-              <w:t>{{PROJECT_EXPERIENCE_1_LOCATION}}</w:t>
+                <w:rFonts w:ascii="Arial Narrow" w:hAnsi="Arial Narrow"/>
+                <w:sz w:val="18"/>
+                <w:szCs w:val="18"/>
+              </w:rPr>
+              <w:t>{{</w:t>
+            </w:r>
+            <w:proofErr w:type="gramEnd"/>
+            <w:r>
+              <w:rPr>
+                <w:rFonts w:ascii="Arial Narrow" w:hAnsi="Arial Narrow"/>
+                <w:sz w:val="18"/>
+                <w:szCs w:val="18"/>
+              </w:rPr>
+              <w:t>PROJECT_EXPERIENCE_1_LOCATION}}</w:t>
             </w:r>
           </w:p>
         </w:tc>
@@ -906,13 +1003,15 @@
               <w:spacing w:line="142" w:lineRule="atLeast"/>
               <w:jc w:val="center"/>
               <w:rPr>
-                <w:b/>
-                <w:sz w:val="18"/>
-                <w:szCs w:val="18"/>
-              </w:rPr>
-            </w:pPr>
-            <w:r>
-              <w:rPr>
+                <w:rFonts w:ascii="Arial Narrow" w:hAnsi="Arial Narrow"/>
+                <w:b/>
+                <w:sz w:val="18"/>
+                <w:szCs w:val="18"/>
+              </w:rPr>
+            </w:pPr>
+            <w:r>
+              <w:rPr>
+                <w:rFonts w:ascii="Arial Narrow" w:hAnsi="Arial Narrow"/>
                 <w:b/>
                 <w:iCs/>
                 <w:sz w:val="18"/>
@@ -1052,12 +1151,14 @@
               <w:adjustRightInd w:val="0"/>
               <w:jc w:val="both"/>
               <w:rPr>
-                <w:sz w:val="18"/>
-                <w:szCs w:val="18"/>
-              </w:rPr>
-            </w:pPr>
-            <w:r>
-              <w:rPr>
+                <w:rFonts w:ascii="Arial Narrow" w:hAnsi="Arial Narrow"/>
+                <w:sz w:val="18"/>
+                <w:szCs w:val="18"/>
+              </w:rPr>
+            </w:pPr>
+            <w:r>
+              <w:rPr>
+                <w:rFonts w:ascii="Arial Narrow" w:hAnsi="Arial Narrow"/>
                 <w:b/>
                 <w:bCs/>
                 <w:sz w:val="18"/>
@@ -1067,6 +1168,7 @@
             </w:r>
             <w:r>
               <w:rPr>
+                <w:rFonts w:ascii="Arial Narrow" w:hAnsi="Arial Narrow"/>
                 <w:b/>
                 <w:bCs/>
                 <w:sz w:val="18"/>
@@ -1076,31 +1178,45 @@
             </w:r>
             <w:r>
               <w:rPr>
+                <w:rFonts w:ascii="Arial Narrow" w:hAnsi="Arial Narrow"/>
                 <w:b/>
                 <w:bCs/>
                 <w:sz w:val="18"/>
                 <w:szCs w:val="18"/>
               </w:rPr>
-              <w:t>_ROLE}}</w:t>
-            </w:r>
-            <w:r>
-              <w:rPr>
+              <w:t>_ROLE}</w:t>
+            </w:r>
+            <w:proofErr w:type="gramStart"/>
+            <w:r>
+              <w:rPr>
+                <w:rFonts w:ascii="Arial Narrow" w:hAnsi="Arial Narrow"/>
                 <w:b/>
                 <w:bCs/>
                 <w:sz w:val="18"/>
                 <w:szCs w:val="18"/>
               </w:rPr>
+              <w:t xml:space="preserve">} </w:t>
+            </w:r>
+            <w:r>
+              <w:rPr>
+                <w:rFonts w:ascii="Arial Narrow" w:hAnsi="Arial Narrow"/>
+                <w:sz w:val="18"/>
+                <w:szCs w:val="18"/>
+              </w:rPr>
+              <w:t>.</w:t>
+            </w:r>
+            <w:proofErr w:type="gramEnd"/>
+            <w:r>
+              <w:rPr>
+                <w:rFonts w:ascii="Arial Narrow" w:hAnsi="Arial Narrow"/>
+                <w:sz w:val="18"/>
+                <w:szCs w:val="18"/>
+              </w:rPr>
               <w:t xml:space="preserve"> </w:t>
             </w:r>
             <w:r>
               <w:rPr>
-                <w:sz w:val="18"/>
-                <w:szCs w:val="18"/>
-              </w:rPr>
-              <w:t xml:space="preserve">. </w:t>
-            </w:r>
-            <w:r>
-              <w:rPr>
+                <w:rFonts w:ascii="Arial Narrow" w:hAnsi="Arial Narrow"/>
                 <w:sz w:val="18"/>
                 <w:szCs w:val="18"/>
               </w:rPr>
@@ -1232,7 +1348,7 @@
             <w:pPr>
               <w:spacing w:line="195" w:lineRule="atLeast"/>
               <w:rPr>
-                <w:rFonts w:ascii="Arial" w:hAnsi="Arial" w:cs="Arial"/>
+                <w:rFonts w:ascii="Arial Narrow" w:hAnsi="Arial Narrow" w:cs="Arial"/>
                 <w:b/>
                 <w:bCs/>
                 <w:sz w:val="18"/>
@@ -1241,6 +1357,7 @@
             </w:pPr>
             <w:r>
               <w:rPr>
+                <w:rFonts w:ascii="Arial Narrow" w:hAnsi="Arial Narrow"/>
                 <w:b/>
                 <w:bCs/>
                 <w:sz w:val="18"/>
@@ -1250,6 +1367,7 @@
             </w:r>
             <w:r>
               <w:rPr>
+                <w:rFonts w:ascii="Arial Narrow" w:hAnsi="Arial Narrow"/>
                 <w:b/>
                 <w:bCs/>
                 <w:sz w:val="18"/>
@@ -1259,35 +1377,45 @@
             </w:r>
             <w:r>
               <w:rPr>
+                <w:rFonts w:ascii="Arial Narrow" w:hAnsi="Arial Narrow"/>
                 <w:b/>
                 <w:bCs/>
                 <w:sz w:val="18"/>
                 <w:szCs w:val="18"/>
               </w:rPr>
-              <w:t>_TITLE}}</w:t>
-            </w:r>
-            <w:r>
-              <w:rPr>
+              <w:t>_</w:t>
+            </w:r>
+            <w:proofErr w:type="gramStart"/>
+            <w:r>
+              <w:rPr>
+                <w:rFonts w:ascii="Arial Narrow" w:hAnsi="Arial Narrow"/>
                 <w:b/>
                 <w:bCs/>
                 <w:sz w:val="18"/>
                 <w:szCs w:val="18"/>
               </w:rPr>
-              <w:t xml:space="preserve">, </w:t>
-            </w:r>
-            <w:r>
-              <w:rPr>
-                <w:b/>
-                <w:bCs/>
-                <w:sz w:val="18"/>
-                <w:szCs w:val="18"/>
-              </w:rPr>
-              <w:t>{{PROJECT_EXPERIENCE_</w:t>
-            </w:r>
-            <w:r>
-              <w:rPr>
-                <w:b/>
-                <w:bCs/>
+              <w:t xml:space="preserve">TITLE}}, </w:t>
+            </w:r>
+            <w:r>
+              <w:rPr>
+                <w:rFonts w:ascii="Arial Narrow" w:hAnsi="Arial Narrow"/>
+                <w:sz w:val="18"/>
+                <w:szCs w:val="18"/>
+              </w:rPr>
+              <w:t>{{</w:t>
+            </w:r>
+            <w:proofErr w:type="gramEnd"/>
+            <w:r>
+              <w:rPr>
+                <w:rFonts w:ascii="Arial Narrow" w:hAnsi="Arial Narrow"/>
+                <w:sz w:val="18"/>
+                <w:szCs w:val="18"/>
+              </w:rPr>
+              <w:t>PROJECT_EXPERIENCE_</w:t>
+            </w:r>
+            <w:r>
+              <w:rPr>
+                <w:rFonts w:ascii="Arial Narrow" w:hAnsi="Arial Narrow"/>
                 <w:sz w:val="18"/>
                 <w:szCs w:val="18"/>
               </w:rPr>
@@ -1295,8 +1423,7 @@
             </w:r>
             <w:r>
               <w:rPr>
-                <w:b/>
-                <w:bCs/>
+                <w:rFonts w:ascii="Arial Narrow" w:hAnsi="Arial Narrow"/>
                 <w:sz w:val="18"/>
                 <w:szCs w:val="18"/>
               </w:rPr>
@@ -1410,13 +1537,15 @@
             <w:pPr>
               <w:jc w:val="center"/>
               <w:rPr>
-                <w:b/>
-                <w:sz w:val="18"/>
-                <w:szCs w:val="18"/>
-              </w:rPr>
-            </w:pPr>
-            <w:r>
-              <w:rPr>
+                <w:rFonts w:ascii="Arial Narrow" w:hAnsi="Arial Narrow"/>
+                <w:b/>
+                <w:sz w:val="18"/>
+                <w:szCs w:val="18"/>
+              </w:rPr>
+            </w:pPr>
+            <w:r>
+              <w:rPr>
+                <w:rFonts w:ascii="Arial Narrow" w:hAnsi="Arial Narrow"/>
                 <w:b/>
                 <w:iCs/>
                 <w:sz w:val="18"/>
@@ -1426,6 +1555,7 @@
             </w:r>
             <w:r>
               <w:rPr>
+                <w:rFonts w:ascii="Arial Narrow" w:hAnsi="Arial Narrow"/>
                 <w:b/>
                 <w:iCs/>
                 <w:sz w:val="18"/>
@@ -1435,6 +1565,7 @@
             </w:r>
             <w:r>
               <w:rPr>
+                <w:rFonts w:ascii="Arial Narrow" w:hAnsi="Arial Narrow"/>
                 <w:b/>
                 <w:iCs/>
                 <w:sz w:val="18"/>
@@ -1614,14 +1745,32 @@
                 <w:sz w:val="18"/>
                 <w:szCs w:val="18"/>
               </w:rPr>
-              <w:t xml:space="preserve">_ROLE}} </w:t>
-            </w:r>
-            <w:r>
-              <w:rPr>
-                <w:sz w:val="18"/>
-                <w:szCs w:val="18"/>
-              </w:rPr>
-              <w:t xml:space="preserve">. </w:t>
+              <w:t>_ROLE}</w:t>
+            </w:r>
+            <w:proofErr w:type="gramStart"/>
+            <w:r>
+              <w:rPr>
+                <w:b/>
+                <w:bCs/>
+                <w:sz w:val="18"/>
+                <w:szCs w:val="18"/>
+              </w:rPr>
+              <w:t xml:space="preserve">} </w:t>
+            </w:r>
+            <w:r>
+              <w:rPr>
+                <w:sz w:val="18"/>
+                <w:szCs w:val="18"/>
+              </w:rPr>
+              <w:t>.</w:t>
+            </w:r>
+            <w:proofErr w:type="gramEnd"/>
+            <w:r>
+              <w:rPr>
+                <w:sz w:val="18"/>
+                <w:szCs w:val="18"/>
+              </w:rPr>
+              <w:t xml:space="preserve"> </w:t>
             </w:r>
             <w:r>
               <w:rPr>
@@ -1769,9 +1918,13 @@
           <w:p>
             <w:pPr>
               <w:spacing w:line="225" w:lineRule="atLeast"/>
-            </w:pPr>
-            <w:r>
-              <w:rPr>
+              <w:rPr>
+                <w:rFonts w:ascii="Arial Narrow" w:hAnsi="Arial Narrow"/>
+              </w:rPr>
+            </w:pPr>
+            <w:r>
+              <w:rPr>
+                <w:rFonts w:ascii="Arial Narrow" w:hAnsi="Arial Narrow"/>
                 <w:b/>
                 <w:bCs/>
                 <w:sz w:val="18"/>
@@ -1781,6 +1934,7 @@
             </w:r>
             <w:r>
               <w:rPr>
+                <w:rFonts w:ascii="Arial Narrow" w:hAnsi="Arial Narrow"/>
                 <w:b/>
                 <w:bCs/>
                 <w:sz w:val="18"/>
@@ -1790,35 +1944,45 @@
             </w:r>
             <w:r>
               <w:rPr>
+                <w:rFonts w:ascii="Arial Narrow" w:hAnsi="Arial Narrow"/>
                 <w:b/>
                 <w:bCs/>
                 <w:sz w:val="18"/>
                 <w:szCs w:val="18"/>
               </w:rPr>
-              <w:t>_TITLE}}</w:t>
-            </w:r>
-            <w:r>
-              <w:rPr>
+              <w:t>_</w:t>
+            </w:r>
+            <w:proofErr w:type="gramStart"/>
+            <w:r>
+              <w:rPr>
+                <w:rFonts w:ascii="Arial Narrow" w:hAnsi="Arial Narrow"/>
                 <w:b/>
                 <w:bCs/>
                 <w:sz w:val="18"/>
                 <w:szCs w:val="18"/>
               </w:rPr>
-              <w:t xml:space="preserve">, </w:t>
-            </w:r>
-            <w:r>
-              <w:rPr>
-                <w:b/>
-                <w:bCs/>
-                <w:sz w:val="18"/>
-                <w:szCs w:val="18"/>
-              </w:rPr>
-              <w:t>{{PROJECT_EXPERIENCE_</w:t>
-            </w:r>
-            <w:r>
-              <w:rPr>
-                <w:b/>
-                <w:bCs/>
+              <w:t xml:space="preserve">TITLE}}, </w:t>
+            </w:r>
+            <w:r>
+              <w:rPr>
+                <w:rFonts w:ascii="Arial Narrow" w:hAnsi="Arial Narrow"/>
+                <w:sz w:val="18"/>
+                <w:szCs w:val="18"/>
+              </w:rPr>
+              <w:t>{{</w:t>
+            </w:r>
+            <w:proofErr w:type="gramEnd"/>
+            <w:r>
+              <w:rPr>
+                <w:rFonts w:ascii="Arial Narrow" w:hAnsi="Arial Narrow"/>
+                <w:sz w:val="18"/>
+                <w:szCs w:val="18"/>
+              </w:rPr>
+              <w:t>PROJECT_EXPERIENCE_</w:t>
+            </w:r>
+            <w:r>
+              <w:rPr>
+                <w:rFonts w:ascii="Arial Narrow" w:hAnsi="Arial Narrow"/>
                 <w:sz w:val="18"/>
                 <w:szCs w:val="18"/>
               </w:rPr>
@@ -1826,8 +1990,7 @@
             </w:r>
             <w:r>
               <w:rPr>
-                <w:b/>
-                <w:bCs/>
+                <w:rFonts w:ascii="Arial Narrow" w:hAnsi="Arial Narrow"/>
                 <w:sz w:val="18"/>
                 <w:szCs w:val="18"/>
               </w:rPr>
@@ -1941,26 +2104,26 @@
             <w:pPr>
               <w:pStyle w:val="Heading3"/>
               <w:rPr>
-                <w:rFonts w:ascii="Times New Roman" w:hAnsi="Times New Roman" w:cs="Times New Roman"/>
-              </w:rPr>
-            </w:pPr>
-            <w:r>
-              <w:rPr>
-                <w:rFonts w:ascii="Times New Roman" w:hAnsi="Times New Roman" w:cs="Times New Roman"/>
+                <w:rFonts w:ascii="Arial Narrow" w:hAnsi="Arial Narrow" w:cs="Times New Roman"/>
+              </w:rPr>
+            </w:pPr>
+            <w:r>
+              <w:rPr>
+                <w:rFonts w:ascii="Arial Narrow" w:hAnsi="Arial Narrow" w:cs="Times New Roman"/>
                 <w:iCs/>
               </w:rPr>
               <w:t>{{PROJECT_EXPERIENCE_</w:t>
             </w:r>
             <w:r>
               <w:rPr>
-                <w:rFonts w:ascii="Times New Roman" w:hAnsi="Times New Roman" w:cs="Times New Roman"/>
+                <w:rFonts w:ascii="Arial Narrow" w:hAnsi="Arial Narrow" w:cs="Times New Roman"/>
                 <w:iCs/>
               </w:rPr>
               <w:t>3</w:t>
             </w:r>
             <w:r>
               <w:rPr>
-                <w:rFonts w:ascii="Times New Roman" w:hAnsi="Times New Roman" w:cs="Times New Roman"/>
+                <w:rFonts w:ascii="Arial Narrow" w:hAnsi="Arial Narrow" w:cs="Times New Roman"/>
                 <w:iCs/>
               </w:rPr>
               <w:t>_YEAR}}</w:t>
@@ -2135,14 +2298,32 @@
                 <w:sz w:val="18"/>
                 <w:szCs w:val="18"/>
               </w:rPr>
-              <w:t xml:space="preserve">_ROLE}} </w:t>
-            </w:r>
-            <w:r>
-              <w:rPr>
-                <w:sz w:val="18"/>
-                <w:szCs w:val="18"/>
-              </w:rPr>
-              <w:t xml:space="preserve">. </w:t>
+              <w:t>_ROLE}</w:t>
+            </w:r>
+            <w:proofErr w:type="gramStart"/>
+            <w:r>
+              <w:rPr>
+                <w:b/>
+                <w:bCs/>
+                <w:sz w:val="18"/>
+                <w:szCs w:val="18"/>
+              </w:rPr>
+              <w:t xml:space="preserve">} </w:t>
+            </w:r>
+            <w:r>
+              <w:rPr>
+                <w:sz w:val="18"/>
+                <w:szCs w:val="18"/>
+              </w:rPr>
+              <w:t>.</w:t>
+            </w:r>
+            <w:proofErr w:type="gramEnd"/>
+            <w:r>
+              <w:rPr>
+                <w:sz w:val="18"/>
+                <w:szCs w:val="18"/>
+              </w:rPr>
+              <w:t xml:space="preserve"> </w:t>
             </w:r>
             <w:r>
               <w:rPr>
@@ -2282,7 +2463,7 @@
               <w:pStyle w:val="Heading2"/>
               <w:spacing w:before="0"/>
               <w:rPr>
-                <w:rFonts w:ascii="Times New Roman" w:hAnsi="Times New Roman" w:cs="Times New Roman"/>
+                <w:rFonts w:ascii="Arial Narrow" w:hAnsi="Arial Narrow" w:cs="Times New Roman"/>
                 <w:i w:val="0"/>
                 <w:iCs w:val="0"/>
                 <w:sz w:val="18"/>
@@ -2291,7 +2472,7 @@
             </w:pPr>
             <w:r>
               <w:rPr>
-                <w:rFonts w:ascii="Times New Roman" w:hAnsi="Times New Roman" w:cs="Times New Roman"/>
+                <w:rFonts w:ascii="Arial Narrow" w:hAnsi="Arial Narrow" w:cs="Times New Roman"/>
                 <w:i w:val="0"/>
                 <w:iCs w:val="0"/>
                 <w:sz w:val="18"/>
@@ -2301,7 +2482,7 @@
             </w:r>
             <w:r>
               <w:rPr>
-                <w:rFonts w:ascii="Times New Roman" w:hAnsi="Times New Roman" w:cs="Times New Roman"/>
+                <w:rFonts w:ascii="Arial Narrow" w:hAnsi="Arial Narrow" w:cs="Times New Roman"/>
                 <w:i w:val="0"/>
                 <w:iCs w:val="0"/>
                 <w:sz w:val="18"/>
@@ -2311,17 +2492,28 @@
             </w:r>
             <w:r>
               <w:rPr>
-                <w:rFonts w:ascii="Times New Roman" w:hAnsi="Times New Roman" w:cs="Times New Roman"/>
+                <w:rFonts w:ascii="Arial Narrow" w:hAnsi="Arial Narrow" w:cs="Times New Roman"/>
                 <w:i w:val="0"/>
                 <w:iCs w:val="0"/>
                 <w:sz w:val="18"/>
                 <w:szCs w:val="18"/>
               </w:rPr>
-              <w:t>_TITLE}}</w:t>
-            </w:r>
-            <w:r>
-              <w:rPr>
-                <w:rFonts w:ascii="Times New Roman" w:hAnsi="Times New Roman" w:cs="Times New Roman"/>
+              <w:t>_</w:t>
+            </w:r>
+            <w:proofErr w:type="gramStart"/>
+            <w:r>
+              <w:rPr>
+                <w:rFonts w:ascii="Arial Narrow" w:hAnsi="Arial Narrow" w:cs="Times New Roman"/>
+                <w:i w:val="0"/>
+                <w:iCs w:val="0"/>
+                <w:sz w:val="18"/>
+                <w:szCs w:val="18"/>
+              </w:rPr>
+              <w:t>TITLE}}</w:t>
+            </w:r>
+            <w:r>
+              <w:rPr>
+                <w:rFonts w:ascii="Arial Narrow" w:hAnsi="Arial Narrow" w:cs="Times New Roman"/>
                 <w:b w:val="0"/>
                 <w:bCs w:val="0"/>
                 <w:i w:val="0"/>
@@ -2329,21 +2521,26 @@
                 <w:sz w:val="18"/>
                 <w:szCs w:val="18"/>
               </w:rPr>
-              <w:t xml:space="preserve">, </w:t>
-            </w:r>
-            <w:r>
-              <w:rPr>
-                <w:rFonts w:ascii="Times New Roman" w:hAnsi="Times New Roman" w:cs="Times New Roman"/>
+              <w:t>, {{</w:t>
+            </w:r>
+            <w:proofErr w:type="gramEnd"/>
+            <w:r>
+              <w:rPr>
+                <w:rFonts w:ascii="Arial Narrow" w:hAnsi="Arial Narrow" w:cs="Times New Roman"/>
+                <w:b w:val="0"/>
+                <w:bCs w:val="0"/>
                 <w:i w:val="0"/>
                 <w:iCs w:val="0"/>
                 <w:sz w:val="18"/>
                 <w:szCs w:val="18"/>
               </w:rPr>
-              <w:t>{{PROJECT_EXPERIENCE_</w:t>
-            </w:r>
-            <w:r>
-              <w:rPr>
-                <w:rFonts w:ascii="Times New Roman" w:hAnsi="Times New Roman" w:cs="Times New Roman"/>
+              <w:t>PROJECT_EXPERIENCE_</w:t>
+            </w:r>
+            <w:r>
+              <w:rPr>
+                <w:rFonts w:ascii="Arial Narrow" w:hAnsi="Arial Narrow" w:cs="Times New Roman"/>
+                <w:b w:val="0"/>
+                <w:bCs w:val="0"/>
                 <w:i w:val="0"/>
                 <w:iCs w:val="0"/>
                 <w:sz w:val="18"/>
@@ -2353,7 +2550,9 @@
             </w:r>
             <w:r>
               <w:rPr>
-                <w:rFonts w:ascii="Times New Roman" w:hAnsi="Times New Roman" w:cs="Times New Roman"/>
+                <w:rFonts w:ascii="Arial Narrow" w:hAnsi="Arial Narrow" w:cs="Times New Roman"/>
+                <w:b w:val="0"/>
+                <w:bCs w:val="0"/>
                 <w:i w:val="0"/>
                 <w:iCs w:val="0"/>
                 <w:sz w:val="18"/>
@@ -2478,9 +2677,13 @@
           <w:p>
             <w:pPr>
               <w:jc w:val="center"/>
-            </w:pPr>
-            <w:r>
-              <w:rPr>
+              <w:rPr>
+                <w:rFonts w:ascii="Arial Narrow" w:hAnsi="Arial Narrow"/>
+              </w:rPr>
+            </w:pPr>
+            <w:r>
+              <w:rPr>
+                <w:rFonts w:ascii="Arial Narrow" w:hAnsi="Arial Narrow"/>
                 <w:b/>
                 <w:iCs/>
                 <w:sz w:val="18"/>
@@ -2490,6 +2693,7 @@
             </w:r>
             <w:r>
               <w:rPr>
+                <w:rFonts w:ascii="Arial Narrow" w:hAnsi="Arial Narrow"/>
                 <w:b/>
                 <w:iCs/>
                 <w:sz w:val="18"/>
@@ -2499,6 +2703,7 @@
             </w:r>
             <w:r>
               <w:rPr>
+                <w:rFonts w:ascii="Arial Narrow" w:hAnsi="Arial Narrow"/>
                 <w:b/>
                 <w:iCs/>
                 <w:sz w:val="18"/>
@@ -2644,8 +2849,14 @@
             </w:tcBorders>
           </w:tcPr>
           <w:p>
-            <w:r>
-              <w:rPr>
+            <w:pPr>
+              <w:rPr>
+                <w:rFonts w:ascii="Arial Narrow" w:hAnsi="Arial Narrow"/>
+              </w:rPr>
+            </w:pPr>
+            <w:r>
+              <w:rPr>
+                <w:rFonts w:ascii="Arial Narrow" w:hAnsi="Arial Narrow"/>
                 <w:b/>
                 <w:bCs/>
                 <w:sz w:val="18"/>
@@ -2655,6 +2866,7 @@
             </w:r>
             <w:r>
               <w:rPr>
+                <w:rFonts w:ascii="Arial Narrow" w:hAnsi="Arial Narrow"/>
                 <w:b/>
                 <w:bCs/>
                 <w:sz w:val="18"/>
@@ -2664,29 +2876,45 @@
             </w:r>
             <w:r>
               <w:rPr>
+                <w:rFonts w:ascii="Arial Narrow" w:hAnsi="Arial Narrow"/>
                 <w:b/>
                 <w:bCs/>
                 <w:sz w:val="18"/>
                 <w:szCs w:val="18"/>
               </w:rPr>
-              <w:t xml:space="preserve">_ROLE}} </w:t>
-            </w:r>
-            <w:r>
-              <w:rPr>
-                <w:sz w:val="18"/>
-                <w:szCs w:val="18"/>
-              </w:rPr>
-              <w:t xml:space="preserve">. </w:t>
-            </w:r>
-            <w:r>
-              <w:rPr>
-                <w:sz w:val="18"/>
-                <w:szCs w:val="18"/>
-              </w:rPr>
-              <w:t>{{PROJECT_EXPERIENCE_</w:t>
-            </w:r>
-            <w:r>
-              <w:rPr>
+              <w:t>_ROLE}</w:t>
+            </w:r>
+            <w:proofErr w:type="gramStart"/>
+            <w:r>
+              <w:rPr>
+                <w:rFonts w:ascii="Arial Narrow" w:hAnsi="Arial Narrow"/>
+                <w:b/>
+                <w:bCs/>
+                <w:sz w:val="18"/>
+                <w:szCs w:val="18"/>
+              </w:rPr>
+              <w:t xml:space="preserve">} </w:t>
+            </w:r>
+            <w:r>
+              <w:rPr>
+                <w:rFonts w:ascii="Arial Narrow" w:hAnsi="Arial Narrow"/>
+                <w:sz w:val="18"/>
+                <w:szCs w:val="18"/>
+              </w:rPr>
+              <w:t>.</w:t>
+            </w:r>
+            <w:proofErr w:type="gramEnd"/>
+            <w:r>
+              <w:rPr>
+                <w:rFonts w:ascii="Arial Narrow" w:hAnsi="Arial Narrow"/>
+                <w:sz w:val="18"/>
+                <w:szCs w:val="18"/>
+              </w:rPr>
+              <w:t xml:space="preserve"> {{PROJECT_EXPERIENCE_</w:t>
+            </w:r>
+            <w:r>
+              <w:rPr>
+                <w:rFonts w:ascii="Arial Narrow" w:hAnsi="Arial Narrow"/>
                 <w:sz w:val="18"/>
                 <w:szCs w:val="18"/>
               </w:rPr>
@@ -2694,6 +2922,7 @@
             </w:r>
             <w:r>
               <w:rPr>
+                <w:rFonts w:ascii="Arial Narrow" w:hAnsi="Arial Narrow"/>
                 <w:sz w:val="18"/>
                 <w:szCs w:val="18"/>
               </w:rPr>
@@ -2833,50 +3062,64 @@
               <w:pStyle w:val="Heading3"/>
               <w:jc w:val="left"/>
               <w:rPr>
-                <w:rFonts w:ascii="Times New Roman" w:hAnsi="Times New Roman" w:cs="Times New Roman"/>
-              </w:rPr>
-            </w:pPr>
-            <w:r>
-              <w:rPr>
-                <w:rFonts w:ascii="Times New Roman" w:hAnsi="Times New Roman" w:cs="Times New Roman"/>
+                <w:rFonts w:ascii="Arial Narrow" w:hAnsi="Arial Narrow" w:cs="Times New Roman"/>
+              </w:rPr>
+            </w:pPr>
+            <w:r>
+              <w:rPr>
+                <w:rFonts w:ascii="Arial Narrow" w:hAnsi="Arial Narrow" w:cs="Times New Roman"/>
               </w:rPr>
               <w:t>{{PROJECT_EXPERIENCE_</w:t>
             </w:r>
             <w:r>
               <w:rPr>
-                <w:rFonts w:ascii="Times New Roman" w:hAnsi="Times New Roman" w:cs="Times New Roman"/>
+                <w:rFonts w:ascii="Arial Narrow" w:hAnsi="Arial Narrow" w:cs="Times New Roman"/>
               </w:rPr>
               <w:t>5</w:t>
             </w:r>
             <w:r>
               <w:rPr>
-                <w:rFonts w:ascii="Times New Roman" w:hAnsi="Times New Roman" w:cs="Times New Roman"/>
-              </w:rPr>
-              <w:t>_TITLE}}</w:t>
-            </w:r>
-            <w:r>
-              <w:rPr>
-                <w:rFonts w:ascii="Times New Roman" w:hAnsi="Times New Roman" w:cs="Times New Roman"/>
+                <w:rFonts w:ascii="Arial Narrow" w:hAnsi="Arial Narrow" w:cs="Times New Roman"/>
+              </w:rPr>
+              <w:t>_</w:t>
+            </w:r>
+            <w:proofErr w:type="gramStart"/>
+            <w:r>
+              <w:rPr>
+                <w:rFonts w:ascii="Arial Narrow" w:hAnsi="Arial Narrow" w:cs="Times New Roman"/>
+              </w:rPr>
+              <w:t>TITLE}}</w:t>
+            </w:r>
+            <w:r>
+              <w:rPr>
+                <w:rFonts w:ascii="Arial Narrow" w:hAnsi="Arial Narrow" w:cs="Times New Roman"/>
                 <w:b w:val="0"/>
                 <w:bCs w:val="0"/>
               </w:rPr>
-              <w:t xml:space="preserve">, </w:t>
-            </w:r>
-            <w:r>
-              <w:rPr>
-                <w:rFonts w:ascii="Times New Roman" w:hAnsi="Times New Roman" w:cs="Times New Roman"/>
-              </w:rPr>
-              <w:t>{{PROJECT_EXPERIENCE_</w:t>
-            </w:r>
-            <w:r>
-              <w:rPr>
-                <w:rFonts w:ascii="Times New Roman" w:hAnsi="Times New Roman" w:cs="Times New Roman"/>
+              <w:t>, {{</w:t>
+            </w:r>
+            <w:proofErr w:type="gramEnd"/>
+            <w:r>
+              <w:rPr>
+                <w:rFonts w:ascii="Arial Narrow" w:hAnsi="Arial Narrow" w:cs="Times New Roman"/>
+                <w:b w:val="0"/>
+                <w:bCs w:val="0"/>
+              </w:rPr>
+              <w:t>PROJECT_EXPERIENCE_</w:t>
+            </w:r>
+            <w:r>
+              <w:rPr>
+                <w:rFonts w:ascii="Arial Narrow" w:hAnsi="Arial Narrow" w:cs="Times New Roman"/>
+                <w:b w:val="0"/>
+                <w:bCs w:val="0"/>
               </w:rPr>
               <w:t>5</w:t>
             </w:r>
             <w:r>
               <w:rPr>
-                <w:rFonts w:ascii="Times New Roman" w:hAnsi="Times New Roman" w:cs="Times New Roman"/>
+                <w:rFonts w:ascii="Arial Narrow" w:hAnsi="Arial Narrow" w:cs="Times New Roman"/>
+                <w:b w:val="0"/>
+                <w:bCs w:val="0"/>
               </w:rPr>
               <w:t>_LOCATION}}</w:t>
             </w:r>
@@ -2998,9 +3241,13 @@
             <w:pPr>
               <w:spacing w:line="60" w:lineRule="atLeast"/>
               <w:jc w:val="center"/>
-            </w:pPr>
-            <w:r>
-              <w:rPr>
+              <w:rPr>
+                <w:rFonts w:ascii="Arial Narrow" w:hAnsi="Arial Narrow"/>
+              </w:rPr>
+            </w:pPr>
+            <w:r>
+              <w:rPr>
+                <w:rFonts w:ascii="Arial Narrow" w:hAnsi="Arial Narrow"/>
                 <w:b/>
                 <w:iCs/>
                 <w:sz w:val="18"/>
@@ -3010,6 +3257,7 @@
             </w:r>
             <w:r>
               <w:rPr>
+                <w:rFonts w:ascii="Arial Narrow" w:hAnsi="Arial Narrow"/>
                 <w:b/>
                 <w:iCs/>
                 <w:sz w:val="18"/>
@@ -3019,6 +3267,7 @@
             </w:r>
             <w:r>
               <w:rPr>
+                <w:rFonts w:ascii="Arial Narrow" w:hAnsi="Arial Narrow"/>
                 <w:b/>
                 <w:iCs/>
                 <w:sz w:val="18"/>
@@ -3177,8 +3426,14 @@
             </w:tcBorders>
           </w:tcPr>
           <w:p>
-            <w:r>
-              <w:rPr>
+            <w:pPr>
+              <w:rPr>
+                <w:rFonts w:ascii="Arial Narrow" w:hAnsi="Arial Narrow"/>
+              </w:rPr>
+            </w:pPr>
+            <w:r>
+              <w:rPr>
+                <w:rFonts w:ascii="Arial Narrow" w:hAnsi="Arial Narrow"/>
                 <w:b/>
                 <w:bCs/>
                 <w:sz w:val="18"/>
@@ -3188,6 +3443,7 @@
             </w:r>
             <w:r>
               <w:rPr>
+                <w:rFonts w:ascii="Arial Narrow" w:hAnsi="Arial Narrow"/>
                 <w:b/>
                 <w:bCs/>
                 <w:sz w:val="18"/>
@@ -3197,29 +3453,45 @@
             </w:r>
             <w:r>
               <w:rPr>
+                <w:rFonts w:ascii="Arial Narrow" w:hAnsi="Arial Narrow"/>
                 <w:b/>
                 <w:bCs/>
                 <w:sz w:val="18"/>
                 <w:szCs w:val="18"/>
               </w:rPr>
-              <w:t xml:space="preserve">_ROLE}} </w:t>
-            </w:r>
-            <w:r>
-              <w:rPr>
-                <w:sz w:val="18"/>
-                <w:szCs w:val="18"/>
-              </w:rPr>
-              <w:t xml:space="preserve">. </w:t>
-            </w:r>
-            <w:r>
-              <w:rPr>
-                <w:sz w:val="18"/>
-                <w:szCs w:val="18"/>
-              </w:rPr>
-              <w:t>{{PROJECT_EXPERIENCE_</w:t>
-            </w:r>
-            <w:r>
-              <w:rPr>
+              <w:t>_ROLE}</w:t>
+            </w:r>
+            <w:proofErr w:type="gramStart"/>
+            <w:r>
+              <w:rPr>
+                <w:rFonts w:ascii="Arial Narrow" w:hAnsi="Arial Narrow"/>
+                <w:b/>
+                <w:bCs/>
+                <w:sz w:val="18"/>
+                <w:szCs w:val="18"/>
+              </w:rPr>
+              <w:t xml:space="preserve">} </w:t>
+            </w:r>
+            <w:r>
+              <w:rPr>
+                <w:rFonts w:ascii="Arial Narrow" w:hAnsi="Arial Narrow"/>
+                <w:sz w:val="18"/>
+                <w:szCs w:val="18"/>
+              </w:rPr>
+              <w:t>.</w:t>
+            </w:r>
+            <w:proofErr w:type="gramEnd"/>
+            <w:r>
+              <w:rPr>
+                <w:rFonts w:ascii="Arial Narrow" w:hAnsi="Arial Narrow"/>
+                <w:sz w:val="18"/>
+                <w:szCs w:val="18"/>
+              </w:rPr>
+              <w:t xml:space="preserve"> {{PROJECT_EXPERIENCE_</w:t>
+            </w:r>
+            <w:r>
+              <w:rPr>
+                <w:rFonts w:ascii="Arial Narrow" w:hAnsi="Arial Narrow"/>
                 <w:sz w:val="18"/>
                 <w:szCs w:val="18"/>
               </w:rPr>
@@ -3227,6 +3499,7 @@
             </w:r>
             <w:r>
               <w:rPr>
+                <w:rFonts w:ascii="Arial Narrow" w:hAnsi="Arial Narrow"/>
                 <w:sz w:val="18"/>
                 <w:szCs w:val="18"/>
               </w:rPr>
@@ -3534,6 +3807,36 @@
     <w:pPr>
       <w:pStyle w:val="Header"/>
     </w:pPr>
+    <w:r>
+      <w:rPr>
+        <w:noProof/>
+      </w:rPr>
+      <w:pict w14:anchorId="5751576A">
+        <v:shapetype id="_x0000_t75" coordsize="21600,21600" o:spt="75" o:preferrelative="t" path="m@4@5l@4@11@9@11@9@5xe" filled="f" stroked="f">
+          <v:stroke joinstyle="miter"/>
+          <v:formulas>
+            <v:f eqn="if lineDrawn pixelLineWidth 0"/>
+            <v:f eqn="sum @0 1 0"/>
+            <v:f eqn="sum 0 0 @1"/>
+            <v:f eqn="prod @2 1 2"/>
+            <v:f eqn="prod @3 21600 pixelWidth"/>
+            <v:f eqn="prod @3 21600 pixelHeight"/>
+            <v:f eqn="sum @0 0 1"/>
+            <v:f eqn="prod @6 1 2"/>
+            <v:f eqn="prod @7 21600 pixelWidth"/>
+            <v:f eqn="sum @8 21600 0"/>
+            <v:f eqn="prod @7 21600 pixelHeight"/>
+            <v:f eqn="sum @10 21600 0"/>
+          </v:formulas>
+          <v:path o:extrusionok="f" gradientshapeok="t" o:connecttype="rect"/>
+          <o:lock v:ext="edit" aspectratio="t"/>
+        </v:shapetype>
+        <v:shape id="WordPictureWatermark60549391" o:spid="_x0000_s1026" type="#_x0000_t75" style="position:absolute;margin-left:0;margin-top:0;width:431.65pt;height:297.55pt;z-index:-251657216;mso-position-horizontal:center;mso-position-horizontal-relative:margin;mso-position-vertical:center;mso-position-vertical-relative:margin" o:allowincell="f">
+          <v:imagedata r:id="rId1" o:title="IMG_8791" gain="19661f" blacklevel="22938f"/>
+          <w10:wrap anchorx="margin" anchory="margin"/>
+        </v:shape>
+      </w:pict>
+    </w:r>
   </w:p>
 </w:hdr>
 </file>
@@ -3545,6 +3848,36 @@
       <w:pStyle w:val="Header"/>
       <w:jc w:val="center"/>
     </w:pPr>
+    <w:r>
+      <w:rPr>
+        <w:noProof/>
+      </w:rPr>
+      <w:pict w14:anchorId="3DC1608C">
+        <v:shapetype id="_x0000_t75" coordsize="21600,21600" o:spt="75" o:preferrelative="t" path="m@4@5l@4@11@9@11@9@5xe" filled="f" stroked="f">
+          <v:stroke joinstyle="miter"/>
+          <v:formulas>
+            <v:f eqn="if lineDrawn pixelLineWidth 0"/>
+            <v:f eqn="sum @0 1 0"/>
+            <v:f eqn="sum 0 0 @1"/>
+            <v:f eqn="prod @2 1 2"/>
+            <v:f eqn="prod @3 21600 pixelWidth"/>
+            <v:f eqn="prod @3 21600 pixelHeight"/>
+            <v:f eqn="sum @0 0 1"/>
+            <v:f eqn="prod @6 1 2"/>
+            <v:f eqn="prod @7 21600 pixelWidth"/>
+            <v:f eqn="sum @8 21600 0"/>
+            <v:f eqn="prod @7 21600 pixelHeight"/>
+            <v:f eqn="sum @10 21600 0"/>
+          </v:formulas>
+          <v:path o:extrusionok="f" gradientshapeok="t" o:connecttype="rect"/>
+          <o:lock v:ext="edit" aspectratio="t"/>
+        </v:shapetype>
+        <v:shape id="WordPictureWatermark60549392" o:spid="_x0000_s1027" type="#_x0000_t75" style="position:absolute;left:0;text-align:left;margin-left:0;margin-top:0;width:431.65pt;height:297.55pt;z-index:-251656192;mso-position-horizontal:center;mso-position-horizontal-relative:margin;mso-position-vertical:center;mso-position-vertical-relative:margin" o:allowincell="f">
+          <v:imagedata r:id="rId1" o:title="IMG_8791" gain="19661f" blacklevel="22938f"/>
+          <w10:wrap anchorx="margin" anchory="margin"/>
+        </v:shape>
+      </w:pict>
+    </w:r>
     <w:r>
       <w:rPr>
         <w:noProof/>
@@ -3567,7 +3900,7 @@
                   </pic:cNvPicPr>
                 </pic:nvPicPr>
                 <pic:blipFill>
-                  <a:blip r:embed="rId1">
+                  <a:blip r:embed="rId2">
                     <a:extLst>
                       <a:ext uri="{28A0092B-C50C-407E-A947-70E740481C1C}">
                         <a14:useLocalDpi xmlns:a14="http://schemas.microsoft.com/office/drawing/2010/main" val="0"/>
@@ -3608,6 +3941,36 @@
     <w:pPr>
       <w:pStyle w:val="Header"/>
     </w:pPr>
+    <w:r>
+      <w:rPr>
+        <w:noProof/>
+      </w:rPr>
+      <w:pict w14:anchorId="2A611997">
+        <v:shapetype id="_x0000_t75" coordsize="21600,21600" o:spt="75" o:preferrelative="t" path="m@4@5l@4@11@9@11@9@5xe" filled="f" stroked="f">
+          <v:stroke joinstyle="miter"/>
+          <v:formulas>
+            <v:f eqn="if lineDrawn pixelLineWidth 0"/>
+            <v:f eqn="sum @0 1 0"/>
+            <v:f eqn="sum 0 0 @1"/>
+            <v:f eqn="prod @2 1 2"/>
+            <v:f eqn="prod @3 21600 pixelWidth"/>
+            <v:f eqn="prod @3 21600 pixelHeight"/>
+            <v:f eqn="sum @0 0 1"/>
+            <v:f eqn="prod @6 1 2"/>
+            <v:f eqn="prod @7 21600 pixelWidth"/>
+            <v:f eqn="sum @8 21600 0"/>
+            <v:f eqn="prod @7 21600 pixelHeight"/>
+            <v:f eqn="sum @10 21600 0"/>
+          </v:formulas>
+          <v:path o:extrusionok="f" gradientshapeok="t" o:connecttype="rect"/>
+          <o:lock v:ext="edit" aspectratio="t"/>
+        </v:shapetype>
+        <v:shape id="WordPictureWatermark60549390" o:spid="_x0000_s1025" type="#_x0000_t75" style="position:absolute;margin-left:0;margin-top:0;width:431.65pt;height:297.55pt;z-index:-251658240;mso-position-horizontal:center;mso-position-horizontal-relative:margin;mso-position-vertical:center;mso-position-vertical-relative:margin" o:allowincell="f">
+          <v:imagedata r:id="rId1" o:title="IMG_8791" gain="19661f" blacklevel="22938f"/>
+          <w10:wrap anchorx="margin" anchory="margin"/>
+        </v:shape>
+      </w:pict>
+    </w:r>
   </w:p>
 </w:hdr>
 </file>
@@ -4927,6 +5290,15 @@
 </file>
 
 <file path=customXml/item1.xml><?xml version="1.0" encoding="utf-8"?>
+<?mso-contentType ?>
+<FormTemplates xmlns="http://schemas.microsoft.com/sharepoint/v3/contenttype/forms">
+  <Display>DocumentLibraryForm</Display>
+  <Edit>DocumentLibraryForm</Edit>
+  <New>DocumentLibraryForm</New>
+</FormTemplates>
+</file>
+
+<file path=customXml/item2.xml><?xml version="1.0" encoding="utf-8"?>
 <ct:contentTypeSchema xmlns:ct="http://schemas.microsoft.com/office/2006/metadata/contentType" xmlns:ma="http://schemas.microsoft.com/office/2006/metadata/properties/metaAttributes" ct:_="" ma:_="" ma:contentTypeName="Document" ma:contentTypeID="0x01010056B17686156FAD48BA558E9DAFAD964C" ma:contentTypeVersion="19" ma:contentTypeDescription="Create a new document." ma:contentTypeScope="" ma:versionID="3754d1cada6cdef169a30f5953821d9d">
   <xsd:schema xmlns:xsd="http://www.w3.org/2001/XMLSchema" xmlns:xs="http://www.w3.org/2001/XMLSchema" xmlns:p="http://schemas.microsoft.com/office/2006/metadata/properties" xmlns:ns2="ce418445-29bb-405e-a503-16fecb07c770" xmlns:ns3="2a1c79aa-5766-4311-93d3-7d903f49c32a" targetNamespace="http://schemas.microsoft.com/office/2006/metadata/properties" ma:root="true" ma:fieldsID="807bf96d0d752a3b8bafaad25397db1c" ns2:_="" ns3:_="">
     <xsd:import namespace="ce418445-29bb-405e-a503-16fecb07c770"/>
@@ -5187,7 +5559,7 @@
 </ct:contentTypeSchema>
 </file>
 
-<file path=customXml/item2.xml><?xml version="1.0" encoding="utf-8"?>
+<file path=customXml/item3.xml><?xml version="1.0" encoding="utf-8"?>
 <p:properties xmlns:p="http://schemas.microsoft.com/office/2006/metadata/properties" xmlns:xsi="http://www.w3.org/2001/XMLSchema-instance" xmlns:pc="http://schemas.microsoft.com/office/infopath/2007/PartnerControls">
   <documentManagement>
     <TaxCatchAll xmlns="2a1c79aa-5766-4311-93d3-7d903f49c32a"/>
@@ -5198,16 +5570,15 @@
 </p:properties>
 </file>
 
-<file path=customXml/item3.xml><?xml version="1.0" encoding="utf-8"?>
-<?mso-contentType ?>
-<FormTemplates xmlns="http://schemas.microsoft.com/sharepoint/v3/contenttype/forms">
-  <Display>DocumentLibraryForm</Display>
-  <Edit>DocumentLibraryForm</Edit>
-  <New>DocumentLibraryForm</New>
-</FormTemplates>
+<file path=customXml/itemProps1.xml><?xml version="1.0" encoding="utf-8"?>
+<ds:datastoreItem xmlns:ds="http://schemas.openxmlformats.org/officeDocument/2006/customXml" ds:itemID="{1DBD80AC-BB67-427F-8A10-BA3A84FAA580}">
+  <ds:schemaRefs>
+    <ds:schemaRef ds:uri="http://schemas.microsoft.com/sharepoint/v3/contenttype/forms"/>
+  </ds:schemaRefs>
+</ds:datastoreItem>
 </file>
 
-<file path=customXml/itemProps1.xml><?xml version="1.0" encoding="utf-8"?>
+<file path=customXml/itemProps2.xml><?xml version="1.0" encoding="utf-8"?>
 <ds:datastoreItem xmlns:ds="http://schemas.openxmlformats.org/officeDocument/2006/customXml" ds:itemID="{65D76C26-DE71-47F3-9911-0BD1A86342A1}">
   <ds:schemaRefs>
     <ds:schemaRef ds:uri="http://schemas.microsoft.com/office/2006/metadata/contentType"/>
@@ -5226,7 +5597,7 @@
 </ds:datastoreItem>
 </file>
 
-<file path=customXml/itemProps2.xml><?xml version="1.0" encoding="utf-8"?>
+<file path=customXml/itemProps3.xml><?xml version="1.0" encoding="utf-8"?>
 <ds:datastoreItem xmlns:ds="http://schemas.openxmlformats.org/officeDocument/2006/customXml" ds:itemID="{EB4C7DAE-F7BF-44C1-947E-1FEDF1B1951E}">
   <ds:schemaRefs>
     <ds:schemaRef ds:uri="http://schemas.microsoft.com/office/2006/metadata/properties"/>
@@ -5235,12 +5606,4 @@
     <ds:schemaRef ds:uri="ce418445-29bb-405e-a503-16fecb07c770"/>
   </ds:schemaRefs>
 </ds:datastoreItem>
-</file>
-
-<file path=customXml/itemProps3.xml><?xml version="1.0" encoding="utf-8"?>
-<ds:datastoreItem xmlns:ds="http://schemas.openxmlformats.org/officeDocument/2006/customXml" ds:itemID="{1DBD80AC-BB67-427F-8A10-BA3A84FAA580}">
-  <ds:schemaRefs>
-    <ds:schemaRef ds:uri="http://schemas.microsoft.com/sharepoint/v3/contenttype/forms"/>
-  </ds:schemaRefs>
-</ds:datastoreItem>
 </file>
</xml_diff>

<commit_message>
Remove watermark from SF330 resume template for consistent formatting
Update the SF330 Section E template to remove the watermark image, ensuring consistent document generation across all proposal and individual resume outputs.

Replit-Commit-Author: Agent
Replit-Commit-Session-Id: 7b7d5aea-535d-4f8f-9c25-a0db79855651
Replit-Commit-Checkpoint-Type: full_checkpoint
Replit-Commit-Event-Id: 03c05258-9565-467c-8e7f-4ed790f82e49
Replit-Commit-Screenshot-Url: https://storage.googleapis.com/screenshot-production-us-central1/af2874c8-850c-400e-9904-a383accec6ca/7b7d5aea-535d-4f8f-9c25-a0db79855651/xbGDf6s
Replit-Helium-Checkpoint-Created: true
</commit_message>
<xml_diff>
--- a/attached_assets/sf330_section_e_template.docx
+++ b/attached_assets/sf330_section_e_template.docx
@@ -3848,36 +3848,6 @@
       <w:pStyle w:val="Header"/>
       <w:jc w:val="center"/>
     </w:pPr>
-    <w:r>
-      <w:rPr>
-        <w:noProof/>
-      </w:rPr>
-      <w:pict w14:anchorId="3DC1608C">
-        <v:shapetype id="_x0000_t75" coordsize="21600,21600" o:spt="75" o:preferrelative="t" path="m@4@5l@4@11@9@11@9@5xe" filled="f" stroked="f">
-          <v:stroke joinstyle="miter"/>
-          <v:formulas>
-            <v:f eqn="if lineDrawn pixelLineWidth 0"/>
-            <v:f eqn="sum @0 1 0"/>
-            <v:f eqn="sum 0 0 @1"/>
-            <v:f eqn="prod @2 1 2"/>
-            <v:f eqn="prod @3 21600 pixelWidth"/>
-            <v:f eqn="prod @3 21600 pixelHeight"/>
-            <v:f eqn="sum @0 0 1"/>
-            <v:f eqn="prod @6 1 2"/>
-            <v:f eqn="prod @7 21600 pixelWidth"/>
-            <v:f eqn="sum @8 21600 0"/>
-            <v:f eqn="prod @7 21600 pixelHeight"/>
-            <v:f eqn="sum @10 21600 0"/>
-          </v:formulas>
-          <v:path o:extrusionok="f" gradientshapeok="t" o:connecttype="rect"/>
-          <o:lock v:ext="edit" aspectratio="t"/>
-        </v:shapetype>
-        <v:shape id="WordPictureWatermark60549392" o:spid="_x0000_s1027" type="#_x0000_t75" style="position:absolute;left:0;text-align:left;margin-left:0;margin-top:0;width:431.65pt;height:297.55pt;z-index:-251656192;mso-position-horizontal:center;mso-position-horizontal-relative:margin;mso-position-vertical:center;mso-position-vertical-relative:margin" o:allowincell="f">
-          <v:imagedata r:id="rId1" o:title="IMG_8791" gain="19661f" blacklevel="22938f"/>
-          <w10:wrap anchorx="margin" anchory="margin"/>
-        </v:shape>
-      </w:pict>
-    </w:r>
     <w:r>
       <w:rPr>
         <w:noProof/>

</xml_diff>

<commit_message>
Update resume template and remove watermark
Replace SF330 Section E resume template with a new version that removes the watermark and fixes a typo in block c.

Replit-Commit-Author: Agent
Replit-Commit-Session-Id: 7b7d5aea-535d-4f8f-9c25-a0db79855651
Replit-Commit-Checkpoint-Type: full_checkpoint
Replit-Commit-Event-Id: f3233d2a-0404-44a8-98b7-81c293500003
Replit-Commit-Screenshot-Url: https://storage.googleapis.com/screenshot-production-us-central1/af2874c8-850c-400e-9904-a383accec6ca/7b7d5aea-535d-4f8f-9c25-a0db79855651/xbGDf6s
Replit-Helium-Checkpoint-Created: true
</commit_message>
<xml_diff>
--- a/attached_assets/sf330_section_e_template.docx
+++ b/attached_assets/sf330_section_e_template.docx
@@ -2330,7 +2330,7 @@
                 <w:sz w:val="18"/>
                 <w:szCs w:val="18"/>
               </w:rPr>
-              <w:t>{{PROJECT_EXPERIENCE_1_DESCRIPTION}}</w:t>
+              <w:t>{{PROJECT_EXPERIENCE_3_DESCRIPTION}}</w:t>
             </w:r>
           </w:p>
         </w:tc>
@@ -3807,36 +3807,6 @@
     <w:pPr>
       <w:pStyle w:val="Header"/>
     </w:pPr>
-    <w:r>
-      <w:rPr>
-        <w:noProof/>
-      </w:rPr>
-      <w:pict w14:anchorId="5751576A">
-        <v:shapetype id="_x0000_t75" coordsize="21600,21600" o:spt="75" o:preferrelative="t" path="m@4@5l@4@11@9@11@9@5xe" filled="f" stroked="f">
-          <v:stroke joinstyle="miter"/>
-          <v:formulas>
-            <v:f eqn="if lineDrawn pixelLineWidth 0"/>
-            <v:f eqn="sum @0 1 0"/>
-            <v:f eqn="sum 0 0 @1"/>
-            <v:f eqn="prod @2 1 2"/>
-            <v:f eqn="prod @3 21600 pixelWidth"/>
-            <v:f eqn="prod @3 21600 pixelHeight"/>
-            <v:f eqn="sum @0 0 1"/>
-            <v:f eqn="prod @6 1 2"/>
-            <v:f eqn="prod @7 21600 pixelWidth"/>
-            <v:f eqn="sum @8 21600 0"/>
-            <v:f eqn="prod @7 21600 pixelHeight"/>
-            <v:f eqn="sum @10 21600 0"/>
-          </v:formulas>
-          <v:path o:extrusionok="f" gradientshapeok="t" o:connecttype="rect"/>
-          <o:lock v:ext="edit" aspectratio="t"/>
-        </v:shapetype>
-        <v:shape id="WordPictureWatermark60549391" o:spid="_x0000_s1026" type="#_x0000_t75" style="position:absolute;margin-left:0;margin-top:0;width:431.65pt;height:297.55pt;z-index:-251657216;mso-position-horizontal:center;mso-position-horizontal-relative:margin;mso-position-vertical:center;mso-position-vertical-relative:margin" o:allowincell="f">
-          <v:imagedata r:id="rId1" o:title="IMG_8791" gain="19661f" blacklevel="22938f"/>
-          <w10:wrap anchorx="margin" anchory="margin"/>
-        </v:shape>
-      </w:pict>
-    </w:r>
   </w:p>
 </w:hdr>
 </file>
@@ -3870,7 +3840,7 @@
                   </pic:cNvPicPr>
                 </pic:nvPicPr>
                 <pic:blipFill>
-                  <a:blip r:embed="rId2">
+                  <a:blip r:embed="rId1">
                     <a:extLst>
                       <a:ext uri="{28A0092B-C50C-407E-A947-70E740481C1C}">
                         <a14:useLocalDpi xmlns:a14="http://schemas.microsoft.com/office/drawing/2010/main" val="0"/>
@@ -3911,36 +3881,6 @@
     <w:pPr>
       <w:pStyle w:val="Header"/>
     </w:pPr>
-    <w:r>
-      <w:rPr>
-        <w:noProof/>
-      </w:rPr>
-      <w:pict w14:anchorId="2A611997">
-        <v:shapetype id="_x0000_t75" coordsize="21600,21600" o:spt="75" o:preferrelative="t" path="m@4@5l@4@11@9@11@9@5xe" filled="f" stroked="f">
-          <v:stroke joinstyle="miter"/>
-          <v:formulas>
-            <v:f eqn="if lineDrawn pixelLineWidth 0"/>
-            <v:f eqn="sum @0 1 0"/>
-            <v:f eqn="sum 0 0 @1"/>
-            <v:f eqn="prod @2 1 2"/>
-            <v:f eqn="prod @3 21600 pixelWidth"/>
-            <v:f eqn="prod @3 21600 pixelHeight"/>
-            <v:f eqn="sum @0 0 1"/>
-            <v:f eqn="prod @6 1 2"/>
-            <v:f eqn="prod @7 21600 pixelWidth"/>
-            <v:f eqn="sum @8 21600 0"/>
-            <v:f eqn="prod @7 21600 pixelHeight"/>
-            <v:f eqn="sum @10 21600 0"/>
-          </v:formulas>
-          <v:path o:extrusionok="f" gradientshapeok="t" o:connecttype="rect"/>
-          <o:lock v:ext="edit" aspectratio="t"/>
-        </v:shapetype>
-        <v:shape id="WordPictureWatermark60549390" o:spid="_x0000_s1025" type="#_x0000_t75" style="position:absolute;margin-left:0;margin-top:0;width:431.65pt;height:297.55pt;z-index:-251658240;mso-position-horizontal:center;mso-position-horizontal-relative:margin;mso-position-vertical:center;mso-position-vertical-relative:margin" o:allowincell="f">
-          <v:imagedata r:id="rId1" o:title="IMG_8791" gain="19661f" blacklevel="22938f"/>
-          <w10:wrap anchorx="margin" anchory="margin"/>
-        </v:shape>
-      </w:pict>
-    </w:r>
   </w:p>
 </w:hdr>
 </file>
@@ -5260,12 +5200,14 @@
 </file>
 
 <file path=customXml/item1.xml><?xml version="1.0" encoding="utf-8"?>
-<?mso-contentType ?>
-<FormTemplates xmlns="http://schemas.microsoft.com/sharepoint/v3/contenttype/forms">
-  <Display>DocumentLibraryForm</Display>
-  <Edit>DocumentLibraryForm</Edit>
-  <New>DocumentLibraryForm</New>
-</FormTemplates>
+<p:properties xmlns:p="http://schemas.microsoft.com/office/2006/metadata/properties" xmlns:xsi="http://www.w3.org/2001/XMLSchema-instance" xmlns:pc="http://schemas.microsoft.com/office/infopath/2007/PartnerControls">
+  <documentManagement>
+    <TaxCatchAll xmlns="2a1c79aa-5766-4311-93d3-7d903f49c32a"/>
+    <lcf76f155ced4ddcb4097134ff3c332f xmlns="ce418445-29bb-405e-a503-16fecb07c770">
+      <Terms xmlns="http://schemas.microsoft.com/office/infopath/2007/PartnerControls"/>
+    </lcf76f155ced4ddcb4097134ff3c332f>
+  </documentManagement>
+</p:properties>
 </file>
 
 <file path=customXml/item2.xml><?xml version="1.0" encoding="utf-8"?>
@@ -5530,20 +5472,21 @@
 </file>
 
 <file path=customXml/item3.xml><?xml version="1.0" encoding="utf-8"?>
-<p:properties xmlns:p="http://schemas.microsoft.com/office/2006/metadata/properties" xmlns:xsi="http://www.w3.org/2001/XMLSchema-instance" xmlns:pc="http://schemas.microsoft.com/office/infopath/2007/PartnerControls">
-  <documentManagement>
-    <TaxCatchAll xmlns="2a1c79aa-5766-4311-93d3-7d903f49c32a"/>
-    <lcf76f155ced4ddcb4097134ff3c332f xmlns="ce418445-29bb-405e-a503-16fecb07c770">
-      <Terms xmlns="http://schemas.microsoft.com/office/infopath/2007/PartnerControls"/>
-    </lcf76f155ced4ddcb4097134ff3c332f>
-  </documentManagement>
-</p:properties>
+<?mso-contentType ?>
+<FormTemplates xmlns="http://schemas.microsoft.com/sharepoint/v3/contenttype/forms">
+  <Display>DocumentLibraryForm</Display>
+  <Edit>DocumentLibraryForm</Edit>
+  <New>DocumentLibraryForm</New>
+</FormTemplates>
 </file>
 
 <file path=customXml/itemProps1.xml><?xml version="1.0" encoding="utf-8"?>
-<ds:datastoreItem xmlns:ds="http://schemas.openxmlformats.org/officeDocument/2006/customXml" ds:itemID="{1DBD80AC-BB67-427F-8A10-BA3A84FAA580}">
+<ds:datastoreItem xmlns:ds="http://schemas.openxmlformats.org/officeDocument/2006/customXml" ds:itemID="{EB4C7DAE-F7BF-44C1-947E-1FEDF1B1951E}">
   <ds:schemaRefs>
-    <ds:schemaRef ds:uri="http://schemas.microsoft.com/sharepoint/v3/contenttype/forms"/>
+    <ds:schemaRef ds:uri="http://schemas.microsoft.com/office/2006/metadata/properties"/>
+    <ds:schemaRef ds:uri="http://schemas.microsoft.com/office/infopath/2007/PartnerControls"/>
+    <ds:schemaRef ds:uri="2a1c79aa-5766-4311-93d3-7d903f49c32a"/>
+    <ds:schemaRef ds:uri="ce418445-29bb-405e-a503-16fecb07c770"/>
   </ds:schemaRefs>
 </ds:datastoreItem>
 </file>
@@ -5568,12 +5511,9 @@
 </file>
 
 <file path=customXml/itemProps3.xml><?xml version="1.0" encoding="utf-8"?>
-<ds:datastoreItem xmlns:ds="http://schemas.openxmlformats.org/officeDocument/2006/customXml" ds:itemID="{EB4C7DAE-F7BF-44C1-947E-1FEDF1B1951E}">
+<ds:datastoreItem xmlns:ds="http://schemas.openxmlformats.org/officeDocument/2006/customXml" ds:itemID="{1DBD80AC-BB67-427F-8A10-BA3A84FAA580}">
   <ds:schemaRefs>
-    <ds:schemaRef ds:uri="http://schemas.microsoft.com/office/2006/metadata/properties"/>
-    <ds:schemaRef ds:uri="http://schemas.microsoft.com/office/infopath/2007/PartnerControls"/>
-    <ds:schemaRef ds:uri="2a1c79aa-5766-4311-93d3-7d903f49c32a"/>
-    <ds:schemaRef ds:uri="ce418445-29bb-405e-a503-16fecb07c770"/>
+    <ds:schemaRef ds:uri="http://schemas.microsoft.com/sharepoint/v3/contenttype/forms"/>
   </ds:schemaRefs>
 </ds:datastoreItem>
 </file>
</xml_diff>

<commit_message>
Update resume template to accommodate new project row positioning
Adjust project block detection logic and label placement to reflect changes in the resume template, ensuring accurate rendering of project details.

Replit-Commit-Author: Agent
Replit-Commit-Session-Id: 7b7d5aea-535d-4f8f-9c25-a0db79855651
Replit-Commit-Checkpoint-Type: intermediate_checkpoint
Replit-Commit-Event-Id: 92ad4020-5cef-4e91-bea7-6cbbaaad9c25
Replit-Commit-Screenshot-Url: https://storage.googleapis.com/screenshot-production-us-central1/af2874c8-850c-400e-9904-a383accec6ca/7b7d5aea-535d-4f8f-9c25-a0db79855651/zSmOqxk
Replit-Helium-Checkpoint-Created: true
</commit_message>
<xml_diff>
--- a/attached_assets/sf330_section_e_template.docx
+++ b/attached_assets/sf330_section_e_template.docx
@@ -5,7 +5,8 @@
     <w:tbl>
       <w:tblPr>
         <w:tblpPr w:leftFromText="180" w:rightFromText="180" w:vertAnchor="text" w:horzAnchor="margin" w:tblpXSpec="center" w:tblpY="-536"/>
-        <w:tblW w:w="11220" w:type="dxa"/>
+        <w:tblW w:w="11240" w:type="dxa"/>
+        <w:tblLayout w:type="fixed"/>
         <w:tblCellMar>
           <w:left w:w="0" w:type="dxa"/>
           <w:right w:w="0" w:type="dxa"/>
@@ -13,11 +14,11 @@
         <w:tblLook w:val="0000" w:firstRow="0" w:lastRow="0" w:firstColumn="0" w:lastColumn="0" w:noHBand="0" w:noVBand="0"/>
       </w:tblPr>
       <w:tblGrid>
-        <w:gridCol w:w="343"/>
-        <w:gridCol w:w="2537"/>
-        <w:gridCol w:w="2154"/>
-        <w:gridCol w:w="3212"/>
-        <w:gridCol w:w="2974"/>
+        <w:gridCol w:w="265"/>
+        <w:gridCol w:w="3428"/>
+        <w:gridCol w:w="2967"/>
+        <w:gridCol w:w="2250"/>
+        <w:gridCol w:w="2330"/>
       </w:tblGrid>
       <w:tr>
         <w:trPr>
@@ -26,7 +27,7 @@
         </w:trPr>
         <w:tc>
           <w:tcPr>
-            <w:tcW w:w="11220" w:type="dxa"/>
+            <w:tcW w:w="11240" w:type="dxa"/>
             <w:gridSpan w:val="5"/>
             <w:tcBorders>
               <w:top w:val="single" w:sz="8" w:space="0" w:color="auto"/>
@@ -91,11 +92,11 @@
       <w:tr>
         <w:trPr>
           <w:cantSplit/>
-          <w:trHeight w:val="237"/>
+          <w:trHeight w:val="235"/>
         </w:trPr>
         <w:tc>
           <w:tcPr>
-            <w:tcW w:w="2880" w:type="dxa"/>
+            <w:tcW w:w="3693" w:type="dxa"/>
             <w:gridSpan w:val="2"/>
             <w:tcBorders>
               <w:top w:val="single" w:sz="8" w:space="0" w:color="auto"/>
@@ -117,7 +118,7 @@
         </w:tc>
         <w:tc>
           <w:tcPr>
-            <w:tcW w:w="2154" w:type="dxa"/>
+            <w:tcW w:w="2967" w:type="dxa"/>
             <w:tcBorders>
               <w:top w:val="single" w:sz="8" w:space="0" w:color="auto"/>
               <w:left w:val="single" w:sz="8" w:space="0" w:color="auto"/>
@@ -132,19 +133,22 @@
             </w:tcMar>
           </w:tcPr>
           <w:p>
+            <w:pPr>
+              <w:jc w:val="center"/>
+            </w:pPr>
             <w:r>
               <w:rPr>
                 <w:rFonts w:ascii="Arial" w:hAnsi="Arial" w:cs="Arial"/>
                 <w:sz w:val="14"/>
                 <w:szCs w:val="14"/>
               </w:rPr>
-              <w:t> 13. ROLE IN THIS CONTRACT</w:t>
-            </w:r>
-          </w:p>
-        </w:tc>
-        <w:tc>
-          <w:tcPr>
-            <w:tcW w:w="6186" w:type="dxa"/>
+              <w:t>13. ROLE IN THIS CONTRACT</w:t>
+            </w:r>
+          </w:p>
+        </w:tc>
+        <w:tc>
+          <w:tcPr>
+            <w:tcW w:w="4580" w:type="dxa"/>
             <w:gridSpan w:val="2"/>
             <w:tcBorders>
               <w:top w:val="single" w:sz="8" w:space="0" w:color="auto"/>
@@ -177,57 +181,79 @@
       <w:tr>
         <w:trPr>
           <w:cantSplit/>
-          <w:trHeight w:val="403"/>
+          <w:trHeight w:val="613"/>
         </w:trPr>
         <w:tc>
           <w:tcPr>
-            <w:tcW w:w="2880" w:type="dxa"/>
+            <w:tcW w:w="3693" w:type="dxa"/>
             <w:gridSpan w:val="2"/>
           </w:tcPr>
           <w:p>
             <w:pPr>
               <w:pStyle w:val="Heading2"/>
+              <w:spacing w:before="0" w:after="0"/>
               <w:rPr>
                 <w:rFonts w:ascii="Arial Narrow" w:hAnsi="Arial Narrow" w:cs="Times New Roman"/>
+                <w:sz w:val="18"/>
+                <w:szCs w:val="18"/>
               </w:rPr>
             </w:pPr>
             <w:r>
               <w:rPr>
                 <w:rFonts w:ascii="Arial Narrow" w:hAnsi="Arial Narrow" w:cs="Times New Roman"/>
-                <w:i w:val="0"/>
-                <w:iCs w:val="0"/>
-                <w:sz w:val="18"/>
-                <w:szCs w:val="18"/>
-              </w:rPr>
-              <w:t>{{EMPLOYEE_LAST_</w:t>
-            </w:r>
-            <w:proofErr w:type="gramStart"/>
+                <w:sz w:val="18"/>
+                <w:szCs w:val="18"/>
+              </w:rPr>
+              <w:t>{{</w:t>
+            </w:r>
             <w:r>
               <w:rPr>
                 <w:rFonts w:ascii="Arial Narrow" w:hAnsi="Arial Narrow" w:cs="Times New Roman"/>
-                <w:i w:val="0"/>
-                <w:iCs w:val="0"/>
-                <w:sz w:val="18"/>
-                <w:szCs w:val="18"/>
-              </w:rPr>
-              <w:t>NAME}}, {{</w:t>
-            </w:r>
-            <w:proofErr w:type="gramEnd"/>
+                <w:sz w:val="18"/>
+                <w:szCs w:val="18"/>
+              </w:rPr>
+              <w:t>EMPLOYEE_FIRST_NAME}}</w:t>
+            </w:r>
             <w:r>
               <w:rPr>
                 <w:rFonts w:ascii="Arial Narrow" w:hAnsi="Arial Narrow" w:cs="Times New Roman"/>
-                <w:i w:val="0"/>
-                <w:iCs w:val="0"/>
-                <w:sz w:val="18"/>
-                <w:szCs w:val="18"/>
-              </w:rPr>
-              <w:t>EMPLOYEE_FIRST_NAME}} {{EMPLOYEE_MIDDLE_NAME}}</w:t>
-            </w:r>
-          </w:p>
-        </w:tc>
-        <w:tc>
-          <w:tcPr>
-            <w:tcW w:w="2154" w:type="dxa"/>
+                <w:sz w:val="18"/>
+                <w:szCs w:val="18"/>
+              </w:rPr>
+              <w:t xml:space="preserve"> </w:t>
+            </w:r>
+            <w:r>
+              <w:rPr>
+                <w:rFonts w:ascii="Arial Narrow" w:hAnsi="Arial Narrow" w:cs="Times New Roman"/>
+                <w:sz w:val="18"/>
+                <w:szCs w:val="18"/>
+              </w:rPr>
+              <w:t>{{{EMPLOYEE_MIDDLE_NAME}}</w:t>
+            </w:r>
+          </w:p>
+          <w:p>
+            <w:pPr>
+              <w:pStyle w:val="Heading2"/>
+              <w:spacing w:before="0" w:after="0"/>
+              <w:rPr>
+                <w:rFonts w:ascii="Arial Narrow" w:hAnsi="Arial Narrow" w:cs="Times New Roman"/>
+                <w:sz w:val="18"/>
+                <w:szCs w:val="18"/>
+              </w:rPr>
+            </w:pPr>
+            <w:r>
+              <w:rPr>
+                <w:rFonts w:ascii="Arial Narrow" w:hAnsi="Arial Narrow" w:cs="Times New Roman"/>
+                <w:sz w:val="18"/>
+                <w:szCs w:val="18"/>
+              </w:rPr>
+              <w:t>{{EMPLOYEE_LAST_NAME}}</w:t>
+            </w:r>
+          </w:p>
+        </w:tc>
+        <w:tc>
+          <w:tcPr>
+            <w:tcW w:w="2967" w:type="dxa"/>
             <w:tcBorders>
               <w:top w:val="nil"/>
               <w:left w:val="single" w:sz="8" w:space="0" w:color="auto"/>
@@ -243,6 +269,7 @@
           </w:tcPr>
           <w:p>
             <w:pPr>
+              <w:jc w:val="center"/>
               <w:rPr>
                 <w:rFonts w:ascii="Arial Narrow" w:hAnsi="Arial Narrow" w:cs="Arial"/>
                 <w:b/>
@@ -254,6 +281,7 @@
           </w:p>
           <w:p>
             <w:pPr>
+              <w:jc w:val="center"/>
               <w:rPr>
                 <w:b/>
               </w:rPr>
@@ -272,7 +300,7 @@
         </w:tc>
         <w:tc>
           <w:tcPr>
-            <w:tcW w:w="3212" w:type="dxa"/>
+            <w:tcW w:w="2250" w:type="dxa"/>
             <w:tcBorders>
               <w:top w:val="single" w:sz="8" w:space="0" w:color="auto"/>
               <w:left w:val="single" w:sz="8" w:space="0" w:color="auto"/>
@@ -319,7 +347,7 @@
         </w:tc>
         <w:tc>
           <w:tcPr>
-            <w:tcW w:w="2974" w:type="dxa"/>
+            <w:tcW w:w="2330" w:type="dxa"/>
             <w:tcBorders>
               <w:top w:val="single" w:sz="8" w:space="0" w:color="auto"/>
               <w:left w:val="single" w:sz="8" w:space="0" w:color="auto"/>
@@ -347,15 +375,15 @@
             <w:pPr>
               <w:jc w:val="center"/>
               <w:rPr>
-                <w:rFonts w:ascii="Arial" w:hAnsi="Arial" w:cs="Arial"/>
-                <w:b/>
-                <w:sz w:val="18"/>
-                <w:szCs w:val="18"/>
-              </w:rPr>
-            </w:pPr>
-            <w:r>
-              <w:rPr>
-                <w:rFonts w:ascii="Arial" w:hAnsi="Arial" w:cs="Arial"/>
+                <w:rFonts w:ascii="Arial Narrow" w:hAnsi="Arial Narrow" w:cs="Arial"/>
+                <w:b/>
+                <w:sz w:val="18"/>
+                <w:szCs w:val="18"/>
+              </w:rPr>
+            </w:pPr>
+            <w:r>
+              <w:rPr>
+                <w:rFonts w:ascii="Arial Narrow" w:hAnsi="Arial Narrow" w:cs="Arial"/>
                 <w:b/>
                 <w:sz w:val="18"/>
                 <w:szCs w:val="18"/>
@@ -372,7 +400,7 @@
         </w:trPr>
         <w:tc>
           <w:tcPr>
-            <w:tcW w:w="11220" w:type="dxa"/>
+            <w:tcW w:w="11240" w:type="dxa"/>
             <w:gridSpan w:val="5"/>
             <w:tcBorders>
               <w:top w:val="single" w:sz="8" w:space="0" w:color="auto"/>
@@ -388,12 +416,21 @@
             </w:tcMar>
           </w:tcPr>
           <w:p>
-            <w:r>
-              <w:rPr>
-                <w:rFonts w:ascii="Arial" w:hAnsi="Arial" w:cs="Arial"/>
+            <w:pPr>
+              <w:pStyle w:val="Heading2"/>
+              <w:spacing w:before="0" w:after="0"/>
+              <w:rPr>
+                <w:i w:val="0"/>
                 <w:sz w:val="14"/>
                 <w:szCs w:val="14"/>
               </w:rPr>
+            </w:pPr>
+            <w:r>
+              <w:rPr>
+                <w:i w:val="0"/>
+                <w:sz w:val="14"/>
+                <w:szCs w:val="14"/>
+              </w:rPr>
               <w:t>15. FIRM NAME AND LOCATION (City and State)</w:t>
             </w:r>
           </w:p>
@@ -404,15 +441,16 @@
               <w:rPr>
                 <w:rFonts w:ascii="Arial Narrow" w:hAnsi="Arial Narrow" w:cs="Times New Roman"/>
                 <w:i w:val="0"/>
+                <w:sz w:val="20"/>
+                <w:szCs w:val="20"/>
               </w:rPr>
             </w:pPr>
             <w:r>
               <w:rPr>
                 <w:rFonts w:ascii="Arial Narrow" w:hAnsi="Arial Narrow" w:cs="Times New Roman"/>
                 <w:i w:val="0"/>
-                <w:iCs w:val="0"/>
-                <w:sz w:val="18"/>
-                <w:szCs w:val="18"/>
+                <w:sz w:val="20"/>
+                <w:szCs w:val="20"/>
               </w:rPr>
               <w:t>{{FIRM_</w:t>
             </w:r>
@@ -421,62 +459,38 @@
               <w:rPr>
                 <w:rFonts w:ascii="Arial Narrow" w:hAnsi="Arial Narrow" w:cs="Times New Roman"/>
                 <w:i w:val="0"/>
-                <w:iCs w:val="0"/>
-                <w:sz w:val="18"/>
-                <w:szCs w:val="18"/>
-              </w:rPr>
-              <w:t>NAME}}</w:t>
-            </w:r>
+                <w:sz w:val="20"/>
+                <w:szCs w:val="20"/>
+              </w:rPr>
+              <w:t>NAME}}, {{</w:t>
+            </w:r>
+            <w:proofErr w:type="gramEnd"/>
             <w:r>
               <w:rPr>
                 <w:rFonts w:ascii="Arial Narrow" w:hAnsi="Arial Narrow" w:cs="Times New Roman"/>
                 <w:i w:val="0"/>
-                <w:iCs w:val="0"/>
-                <w:sz w:val="18"/>
-                <w:szCs w:val="18"/>
-              </w:rPr>
-              <w:t xml:space="preserve">, </w:t>
-            </w:r>
+                <w:sz w:val="20"/>
+                <w:szCs w:val="20"/>
+              </w:rPr>
+              <w:t>EMPLOYEE_</w:t>
+            </w:r>
+            <w:proofErr w:type="gramStart"/>
             <w:r>
               <w:rPr>
                 <w:rFonts w:ascii="Arial Narrow" w:hAnsi="Arial Narrow" w:cs="Times New Roman"/>
                 <w:i w:val="0"/>
-                <w:iCs w:val="0"/>
-                <w:sz w:val="18"/>
-                <w:szCs w:val="18"/>
-              </w:rPr>
-              <w:t>{{</w:t>
+                <w:sz w:val="20"/>
+                <w:szCs w:val="20"/>
+              </w:rPr>
+              <w:t>CITY}}, {{</w:t>
             </w:r>
             <w:proofErr w:type="gramEnd"/>
             <w:r>
               <w:rPr>
                 <w:rFonts w:ascii="Arial Narrow" w:hAnsi="Arial Narrow" w:cs="Times New Roman"/>
                 <w:i w:val="0"/>
-                <w:iCs w:val="0"/>
-                <w:sz w:val="18"/>
-                <w:szCs w:val="18"/>
-              </w:rPr>
-              <w:t>EMPLOYEE_</w:t>
-            </w:r>
-            <w:proofErr w:type="gramStart"/>
-            <w:r>
-              <w:rPr>
-                <w:rFonts w:ascii="Arial Narrow" w:hAnsi="Arial Narrow" w:cs="Times New Roman"/>
-                <w:i w:val="0"/>
-                <w:iCs w:val="0"/>
-                <w:sz w:val="18"/>
-                <w:szCs w:val="18"/>
-              </w:rPr>
-              <w:t>CITY}}, {{</w:t>
-            </w:r>
-            <w:proofErr w:type="gramEnd"/>
-            <w:r>
-              <w:rPr>
-                <w:rFonts w:ascii="Arial Narrow" w:hAnsi="Arial Narrow" w:cs="Times New Roman"/>
-                <w:i w:val="0"/>
-                <w:iCs w:val="0"/>
-                <w:sz w:val="18"/>
-                <w:szCs w:val="18"/>
+                <w:sz w:val="20"/>
+                <w:szCs w:val="20"/>
               </w:rPr>
               <w:t>EMPLOYEE_STATE}}</w:t>
             </w:r>
@@ -490,7 +504,7 @@
         </w:trPr>
         <w:tc>
           <w:tcPr>
-            <w:tcW w:w="2880" w:type="dxa"/>
+            <w:tcW w:w="3693" w:type="dxa"/>
             <w:gridSpan w:val="2"/>
             <w:tcBorders>
               <w:top w:val="single" w:sz="8" w:space="0" w:color="auto"/>
@@ -537,7 +551,7 @@
         </w:tc>
         <w:tc>
           <w:tcPr>
-            <w:tcW w:w="8340" w:type="dxa"/>
+            <w:tcW w:w="7547" w:type="dxa"/>
             <w:gridSpan w:val="3"/>
             <w:tcBorders>
               <w:top w:val="single" w:sz="8" w:space="0" w:color="auto"/>
@@ -588,7 +602,7 @@
         </w:trPr>
         <w:tc>
           <w:tcPr>
-            <w:tcW w:w="11220" w:type="dxa"/>
+            <w:tcW w:w="11240" w:type="dxa"/>
             <w:gridSpan w:val="5"/>
             <w:tcBorders>
               <w:top w:val="single" w:sz="8" w:space="0" w:color="auto"/>
@@ -688,7 +702,7 @@
         </w:trPr>
         <w:tc>
           <w:tcPr>
-            <w:tcW w:w="11220" w:type="dxa"/>
+            <w:tcW w:w="11240" w:type="dxa"/>
             <w:gridSpan w:val="5"/>
             <w:tcBorders>
               <w:top w:val="nil"/>
@@ -724,30 +738,26 @@
         </w:trPr>
         <w:tc>
           <w:tcPr>
-            <w:tcW w:w="343" w:type="dxa"/>
+            <w:tcW w:w="265" w:type="dxa"/>
             <w:tcBorders>
               <w:top w:val="single" w:sz="8" w:space="0" w:color="auto"/>
               <w:left w:val="nil"/>
               <w:bottom w:val="nil"/>
               <w:right w:val="nil"/>
             </w:tcBorders>
-          </w:tcPr>
-          <w:p>
-            <w:r>
-              <w:rPr>
-                <w:rFonts w:ascii="Univers" w:hAnsi="Univers"/>
-                <w:b/>
-                <w:bCs/>
-                <w:sz w:val="18"/>
-                <w:szCs w:val="18"/>
-              </w:rPr>
-              <w:t>a.</w:t>
-            </w:r>
-          </w:p>
-        </w:tc>
-        <w:tc>
-          <w:tcPr>
-            <w:tcW w:w="4691" w:type="dxa"/>
+            <w:shd w:val="clear" w:color="auto" w:fill="CF3910"/>
+          </w:tcPr>
+          <w:p>
+            <w:pPr>
+              <w:rPr>
+                <w:color w:val="FFFFFF" w:themeColor="background1"/>
+              </w:rPr>
+            </w:pPr>
+          </w:p>
+        </w:tc>
+        <w:tc>
+          <w:tcPr>
+            <w:tcW w:w="6395" w:type="dxa"/>
             <w:gridSpan w:val="2"/>
             <w:tcBorders>
               <w:top w:val="single" w:sz="8" w:space="0" w:color="auto"/>
@@ -780,7 +790,7 @@
         </w:tc>
         <w:tc>
           <w:tcPr>
-            <w:tcW w:w="6186" w:type="dxa"/>
+            <w:tcW w:w="4580" w:type="dxa"/>
             <w:gridSpan w:val="2"/>
             <w:tcBorders>
               <w:top w:val="single" w:sz="8" w:space="0" w:color="auto"/>
@@ -812,21 +822,55 @@
         </w:trPr>
         <w:tc>
           <w:tcPr>
-            <w:tcW w:w="343" w:type="dxa"/>
+            <w:tcW w:w="265" w:type="dxa"/>
             <w:vMerge w:val="restart"/>
+            <w:shd w:val="clear" w:color="auto" w:fill="CF3910"/>
           </w:tcPr>
           <w:p>
             <w:pPr>
               <w:spacing w:line="105" w:lineRule="atLeast"/>
-            </w:pPr>
-            <w:r>
-              <w:t> </w:t>
-            </w:r>
-          </w:p>
-        </w:tc>
-        <w:tc>
-          <w:tcPr>
-            <w:tcW w:w="4691" w:type="dxa"/>
+              <w:rPr>
+                <w:color w:val="FFFFFF" w:themeColor="background1"/>
+              </w:rPr>
+            </w:pPr>
+            <w:r>
+              <w:rPr>
+                <w:rFonts w:ascii="Univers" w:hAnsi="Univers"/>
+                <w:b/>
+                <w:bCs/>
+                <w:color w:val="FFFFFF" w:themeColor="background1"/>
+                <w:sz w:val="18"/>
+                <w:szCs w:val="18"/>
+              </w:rPr>
+              <w:t xml:space="preserve"> </w:t>
+            </w:r>
+            <w:r>
+              <w:rPr>
+                <w:rFonts w:ascii="Univers" w:hAnsi="Univers"/>
+                <w:b/>
+                <w:bCs/>
+                <w:color w:val="FFFFFF" w:themeColor="background1"/>
+                <w:sz w:val="18"/>
+                <w:szCs w:val="18"/>
+              </w:rPr>
+              <w:t>a</w:t>
+            </w:r>
+            <w:r>
+              <w:rPr>
+                <w:rFonts w:ascii="Univers" w:hAnsi="Univers"/>
+                <w:b/>
+                <w:bCs/>
+                <w:color w:val="FFFFFF" w:themeColor="background1"/>
+                <w:sz w:val="18"/>
+                <w:szCs w:val="18"/>
+              </w:rPr>
+              <w:t>.</w:t>
+            </w:r>
+          </w:p>
+        </w:tc>
+        <w:tc>
+          <w:tcPr>
+            <w:tcW w:w="6395" w:type="dxa"/>
             <w:gridSpan w:val="2"/>
             <w:vMerge w:val="restart"/>
             <w:tcBorders>
@@ -899,7 +943,7 @@
         </w:tc>
         <w:tc>
           <w:tcPr>
-            <w:tcW w:w="3212" w:type="dxa"/>
+            <w:tcW w:w="2250" w:type="dxa"/>
             <w:tcBorders>
               <w:top w:val="nil"/>
               <w:left w:val="single" w:sz="8" w:space="0" w:color="auto"/>
@@ -925,7 +969,7 @@
         </w:tc>
         <w:tc>
           <w:tcPr>
-            <w:tcW w:w="2974" w:type="dxa"/>
+            <w:tcW w:w="2330" w:type="dxa"/>
             <w:tcBorders>
               <w:top w:val="single" w:sz="8" w:space="0" w:color="auto"/>
               <w:left w:val="single" w:sz="8" w:space="0" w:color="auto"/>
@@ -967,15 +1011,22 @@
         </w:trPr>
         <w:tc>
           <w:tcPr>
-            <w:tcW w:w="343" w:type="dxa"/>
+            <w:tcW w:w="265" w:type="dxa"/>
             <w:vMerge/>
+            <w:shd w:val="clear" w:color="auto" w:fill="CF3910"/>
             <w:vAlign w:val="center"/>
           </w:tcPr>
-          <w:p/>
-        </w:tc>
-        <w:tc>
-          <w:tcPr>
-            <w:tcW w:w="4691" w:type="dxa"/>
+          <w:p>
+            <w:pPr>
+              <w:rPr>
+                <w:color w:val="FFFFFF" w:themeColor="background1"/>
+              </w:rPr>
+            </w:pPr>
+          </w:p>
+        </w:tc>
+        <w:tc>
+          <w:tcPr>
+            <w:tcW w:w="6395" w:type="dxa"/>
             <w:gridSpan w:val="2"/>
             <w:vMerge/>
             <w:tcBorders>
@@ -990,7 +1041,7 @@
         </w:tc>
         <w:tc>
           <w:tcPr>
-            <w:tcW w:w="3212" w:type="dxa"/>
+            <w:tcW w:w="2250" w:type="dxa"/>
             <w:tcBorders>
               <w:top w:val="nil"/>
               <w:left w:val="single" w:sz="8" w:space="0" w:color="auto"/>
@@ -1023,7 +1074,7 @@
         </w:tc>
         <w:tc>
           <w:tcPr>
-            <w:tcW w:w="2974" w:type="dxa"/>
+            <w:tcW w:w="2330" w:type="dxa"/>
             <w:tcBorders>
               <w:top w:val="nil"/>
               <w:left w:val="single" w:sz="8" w:space="0" w:color="auto"/>
@@ -1045,18 +1096,27 @@
         </w:trPr>
         <w:tc>
           <w:tcPr>
-            <w:tcW w:w="343" w:type="dxa"/>
+            <w:tcW w:w="265" w:type="dxa"/>
             <w:vMerge w:val="restart"/>
-          </w:tcPr>
-          <w:p>
-            <w:r>
+            <w:shd w:val="clear" w:color="auto" w:fill="CF3910"/>
+          </w:tcPr>
+          <w:p>
+            <w:pPr>
+              <w:rPr>
+                <w:color w:val="FFFFFF" w:themeColor="background1"/>
+              </w:rPr>
+            </w:pPr>
+            <w:r>
+              <w:rPr>
+                <w:color w:val="FFFFFF" w:themeColor="background1"/>
+              </w:rPr>
               <w:t> </w:t>
             </w:r>
           </w:p>
         </w:tc>
         <w:tc>
           <w:tcPr>
-            <w:tcW w:w="10877" w:type="dxa"/>
+            <w:tcW w:w="10975" w:type="dxa"/>
             <w:gridSpan w:val="4"/>
             <w:tcBorders>
               <w:top w:val="nil"/>
@@ -1127,15 +1187,22 @@
         </w:trPr>
         <w:tc>
           <w:tcPr>
-            <w:tcW w:w="343" w:type="dxa"/>
+            <w:tcW w:w="265" w:type="dxa"/>
             <w:vMerge/>
+            <w:shd w:val="clear" w:color="auto" w:fill="CF3910"/>
             <w:vAlign w:val="center"/>
           </w:tcPr>
-          <w:p/>
-        </w:tc>
-        <w:tc>
-          <w:tcPr>
-            <w:tcW w:w="10877" w:type="dxa"/>
+          <w:p>
+            <w:pPr>
+              <w:rPr>
+                <w:color w:val="FFFFFF" w:themeColor="background1"/>
+              </w:rPr>
+            </w:pPr>
+          </w:p>
+        </w:tc>
+        <w:tc>
+          <w:tcPr>
+            <w:tcW w:w="10975" w:type="dxa"/>
             <w:gridSpan w:val="4"/>
             <w:tcBorders>
               <w:top w:val="nil"/>
@@ -1232,30 +1299,26 @@
         </w:trPr>
         <w:tc>
           <w:tcPr>
-            <w:tcW w:w="343" w:type="dxa"/>
+            <w:tcW w:w="265" w:type="dxa"/>
             <w:tcBorders>
               <w:top w:val="single" w:sz="8" w:space="0" w:color="auto"/>
               <w:left w:val="nil"/>
               <w:bottom w:val="nil"/>
               <w:right w:val="nil"/>
             </w:tcBorders>
-          </w:tcPr>
-          <w:p>
-            <w:r>
-              <w:rPr>
-                <w:rFonts w:ascii="Univers" w:hAnsi="Univers"/>
-                <w:b/>
-                <w:bCs/>
-                <w:sz w:val="18"/>
-                <w:szCs w:val="18"/>
-              </w:rPr>
-              <w:t>b.</w:t>
-            </w:r>
-          </w:p>
-        </w:tc>
-        <w:tc>
-          <w:tcPr>
-            <w:tcW w:w="4691" w:type="dxa"/>
+            <w:shd w:val="clear" w:color="auto" w:fill="CF3910"/>
+          </w:tcPr>
+          <w:p>
+            <w:pPr>
+              <w:rPr>
+                <w:color w:val="FFFFFF" w:themeColor="background1"/>
+              </w:rPr>
+            </w:pPr>
+          </w:p>
+        </w:tc>
+        <w:tc>
+          <w:tcPr>
+            <w:tcW w:w="6395" w:type="dxa"/>
             <w:gridSpan w:val="2"/>
             <w:tcBorders>
               <w:top w:val="nil"/>
@@ -1288,7 +1351,7 @@
         </w:tc>
         <w:tc>
           <w:tcPr>
-            <w:tcW w:w="6186" w:type="dxa"/>
+            <w:tcW w:w="4580" w:type="dxa"/>
             <w:gridSpan w:val="2"/>
             <w:tcBorders>
               <w:top w:val="single" w:sz="8" w:space="0" w:color="auto"/>
@@ -1320,21 +1383,55 @@
         </w:trPr>
         <w:tc>
           <w:tcPr>
-            <w:tcW w:w="343" w:type="dxa"/>
+            <w:tcW w:w="265" w:type="dxa"/>
             <w:vMerge w:val="restart"/>
+            <w:shd w:val="clear" w:color="auto" w:fill="CF3910"/>
           </w:tcPr>
           <w:p>
             <w:pPr>
               <w:spacing w:line="195" w:lineRule="atLeast"/>
-            </w:pPr>
-            <w:r>
-              <w:t> </w:t>
-            </w:r>
-          </w:p>
-        </w:tc>
-        <w:tc>
-          <w:tcPr>
-            <w:tcW w:w="4691" w:type="dxa"/>
+              <w:rPr>
+                <w:color w:val="FFFFFF" w:themeColor="background1"/>
+              </w:rPr>
+            </w:pPr>
+            <w:r>
+              <w:rPr>
+                <w:rFonts w:ascii="Univers" w:hAnsi="Univers"/>
+                <w:b/>
+                <w:bCs/>
+                <w:color w:val="FFFFFF" w:themeColor="background1"/>
+                <w:sz w:val="18"/>
+                <w:szCs w:val="18"/>
+              </w:rPr>
+              <w:t xml:space="preserve"> </w:t>
+            </w:r>
+            <w:r>
+              <w:rPr>
+                <w:rFonts w:ascii="Univers" w:hAnsi="Univers"/>
+                <w:b/>
+                <w:bCs/>
+                <w:color w:val="FFFFFF" w:themeColor="background1"/>
+                <w:sz w:val="18"/>
+                <w:szCs w:val="18"/>
+              </w:rPr>
+              <w:t>b</w:t>
+            </w:r>
+            <w:r>
+              <w:rPr>
+                <w:rFonts w:ascii="Univers" w:hAnsi="Univers"/>
+                <w:b/>
+                <w:bCs/>
+                <w:color w:val="FFFFFF" w:themeColor="background1"/>
+                <w:sz w:val="18"/>
+                <w:szCs w:val="18"/>
+              </w:rPr>
+              <w:t>.</w:t>
+            </w:r>
+          </w:p>
+        </w:tc>
+        <w:tc>
+          <w:tcPr>
+            <w:tcW w:w="6395" w:type="dxa"/>
             <w:gridSpan w:val="2"/>
             <w:vMerge w:val="restart"/>
             <w:tcBorders>
@@ -1433,7 +1530,7 @@
         </w:tc>
         <w:tc>
           <w:tcPr>
-            <w:tcW w:w="3212" w:type="dxa"/>
+            <w:tcW w:w="2250" w:type="dxa"/>
             <w:tcBorders>
               <w:top w:val="nil"/>
               <w:left w:val="single" w:sz="8" w:space="0" w:color="auto"/>
@@ -1459,7 +1556,7 @@
         </w:tc>
         <w:tc>
           <w:tcPr>
-            <w:tcW w:w="2974" w:type="dxa"/>
+            <w:tcW w:w="2330" w:type="dxa"/>
             <w:tcBorders>
               <w:top w:val="single" w:sz="8" w:space="0" w:color="auto"/>
               <w:left w:val="single" w:sz="8" w:space="0" w:color="auto"/>
@@ -1501,15 +1598,22 @@
         </w:trPr>
         <w:tc>
           <w:tcPr>
-            <w:tcW w:w="343" w:type="dxa"/>
+            <w:tcW w:w="265" w:type="dxa"/>
             <w:vMerge/>
+            <w:shd w:val="clear" w:color="auto" w:fill="CF3910"/>
             <w:vAlign w:val="center"/>
           </w:tcPr>
-          <w:p/>
-        </w:tc>
-        <w:tc>
-          <w:tcPr>
-            <w:tcW w:w="4691" w:type="dxa"/>
+          <w:p>
+            <w:pPr>
+              <w:rPr>
+                <w:color w:val="FFFFFF" w:themeColor="background1"/>
+              </w:rPr>
+            </w:pPr>
+          </w:p>
+        </w:tc>
+        <w:tc>
+          <w:tcPr>
+            <w:tcW w:w="6395" w:type="dxa"/>
             <w:gridSpan w:val="2"/>
             <w:vMerge/>
             <w:tcBorders>
@@ -1524,7 +1628,7 @@
         </w:tc>
         <w:tc>
           <w:tcPr>
-            <w:tcW w:w="3212" w:type="dxa"/>
+            <w:tcW w:w="2250" w:type="dxa"/>
             <w:tcBorders>
               <w:top w:val="nil"/>
               <w:left w:val="single" w:sz="8" w:space="0" w:color="auto"/>
@@ -1577,7 +1681,7 @@
         </w:tc>
         <w:tc>
           <w:tcPr>
-            <w:tcW w:w="2974" w:type="dxa"/>
+            <w:tcW w:w="2330" w:type="dxa"/>
             <w:tcBorders>
               <w:top w:val="nil"/>
               <w:left w:val="single" w:sz="8" w:space="0" w:color="auto"/>
@@ -1603,18 +1707,27 @@
         </w:trPr>
         <w:tc>
           <w:tcPr>
-            <w:tcW w:w="343" w:type="dxa"/>
+            <w:tcW w:w="265" w:type="dxa"/>
             <w:vMerge w:val="restart"/>
-          </w:tcPr>
-          <w:p>
-            <w:r>
+            <w:shd w:val="clear" w:color="auto" w:fill="CF3910"/>
+          </w:tcPr>
+          <w:p>
+            <w:pPr>
+              <w:rPr>
+                <w:color w:val="FFFFFF" w:themeColor="background1"/>
+              </w:rPr>
+            </w:pPr>
+            <w:r>
+              <w:rPr>
+                <w:color w:val="FFFFFF" w:themeColor="background1"/>
+              </w:rPr>
               <w:t> </w:t>
             </w:r>
           </w:p>
         </w:tc>
         <w:tc>
           <w:tcPr>
-            <w:tcW w:w="10877" w:type="dxa"/>
+            <w:tcW w:w="10975" w:type="dxa"/>
             <w:gridSpan w:val="4"/>
             <w:tcBorders>
               <w:top w:val="nil"/>
@@ -1693,15 +1806,22 @@
         </w:trPr>
         <w:tc>
           <w:tcPr>
-            <w:tcW w:w="343" w:type="dxa"/>
+            <w:tcW w:w="265" w:type="dxa"/>
             <w:vMerge/>
+            <w:shd w:val="clear" w:color="auto" w:fill="CF3910"/>
             <w:vAlign w:val="center"/>
           </w:tcPr>
-          <w:p/>
-        </w:tc>
-        <w:tc>
-          <w:tcPr>
-            <w:tcW w:w="10877" w:type="dxa"/>
+          <w:p>
+            <w:pPr>
+              <w:rPr>
+                <w:color w:val="FFFFFF" w:themeColor="background1"/>
+              </w:rPr>
+            </w:pPr>
+          </w:p>
+        </w:tc>
+        <w:tc>
+          <w:tcPr>
+            <w:tcW w:w="10975" w:type="dxa"/>
             <w:gridSpan w:val="4"/>
             <w:tcBorders>
               <w:top w:val="nil"/>
@@ -1803,30 +1923,26 @@
         </w:trPr>
         <w:tc>
           <w:tcPr>
-            <w:tcW w:w="343" w:type="dxa"/>
+            <w:tcW w:w="265" w:type="dxa"/>
             <w:tcBorders>
               <w:top w:val="single" w:sz="8" w:space="0" w:color="auto"/>
               <w:left w:val="nil"/>
               <w:bottom w:val="nil"/>
               <w:right w:val="nil"/>
             </w:tcBorders>
-          </w:tcPr>
-          <w:p>
-            <w:r>
-              <w:rPr>
-                <w:rFonts w:ascii="Univers" w:hAnsi="Univers"/>
-                <w:b/>
-                <w:bCs/>
-                <w:sz w:val="18"/>
-                <w:szCs w:val="18"/>
-              </w:rPr>
-              <w:t>c</w:t>
-            </w:r>
-          </w:p>
-        </w:tc>
-        <w:tc>
-          <w:tcPr>
-            <w:tcW w:w="4691" w:type="dxa"/>
+            <w:shd w:val="clear" w:color="auto" w:fill="CF3910"/>
+          </w:tcPr>
+          <w:p>
+            <w:pPr>
+              <w:rPr>
+                <w:color w:val="FFFFFF" w:themeColor="background1"/>
+              </w:rPr>
+            </w:pPr>
+          </w:p>
+        </w:tc>
+        <w:tc>
+          <w:tcPr>
+            <w:tcW w:w="6395" w:type="dxa"/>
             <w:gridSpan w:val="2"/>
             <w:tcBorders>
               <w:top w:val="nil"/>
@@ -1859,7 +1975,7 @@
         </w:tc>
         <w:tc>
           <w:tcPr>
-            <w:tcW w:w="6186" w:type="dxa"/>
+            <w:tcW w:w="4580" w:type="dxa"/>
             <w:gridSpan w:val="2"/>
             <w:tcBorders>
               <w:top w:val="single" w:sz="8" w:space="0" w:color="auto"/>
@@ -1891,21 +2007,55 @@
         </w:trPr>
         <w:tc>
           <w:tcPr>
-            <w:tcW w:w="343" w:type="dxa"/>
+            <w:tcW w:w="265" w:type="dxa"/>
             <w:vMerge w:val="restart"/>
+            <w:shd w:val="clear" w:color="auto" w:fill="CF3910"/>
           </w:tcPr>
           <w:p>
             <w:pPr>
               <w:spacing w:line="225" w:lineRule="atLeast"/>
-            </w:pPr>
-            <w:r>
-              <w:t> </w:t>
-            </w:r>
-          </w:p>
-        </w:tc>
-        <w:tc>
-          <w:tcPr>
-            <w:tcW w:w="4691" w:type="dxa"/>
+              <w:rPr>
+                <w:color w:val="FFFFFF" w:themeColor="background1"/>
+              </w:rPr>
+            </w:pPr>
+            <w:r>
+              <w:rPr>
+                <w:rFonts w:ascii="Univers" w:hAnsi="Univers"/>
+                <w:b/>
+                <w:bCs/>
+                <w:color w:val="FFFFFF" w:themeColor="background1"/>
+                <w:sz w:val="18"/>
+                <w:szCs w:val="18"/>
+              </w:rPr>
+              <w:t xml:space="preserve"> </w:t>
+            </w:r>
+            <w:r>
+              <w:rPr>
+                <w:rFonts w:ascii="Univers" w:hAnsi="Univers"/>
+                <w:b/>
+                <w:bCs/>
+                <w:color w:val="FFFFFF" w:themeColor="background1"/>
+                <w:sz w:val="18"/>
+                <w:szCs w:val="18"/>
+              </w:rPr>
+              <w:t>c</w:t>
+            </w:r>
+            <w:r>
+              <w:rPr>
+                <w:rFonts w:ascii="Univers" w:hAnsi="Univers"/>
+                <w:b/>
+                <w:bCs/>
+                <w:color w:val="FFFFFF" w:themeColor="background1"/>
+                <w:sz w:val="18"/>
+                <w:szCs w:val="18"/>
+              </w:rPr>
+              <w:t>.</w:t>
+            </w:r>
+          </w:p>
+        </w:tc>
+        <w:tc>
+          <w:tcPr>
+            <w:tcW w:w="6395" w:type="dxa"/>
             <w:gridSpan w:val="2"/>
             <w:vMerge w:val="restart"/>
             <w:tcBorders>
@@ -2000,7 +2150,7 @@
         </w:tc>
         <w:tc>
           <w:tcPr>
-            <w:tcW w:w="3212" w:type="dxa"/>
+            <w:tcW w:w="2250" w:type="dxa"/>
             <w:tcBorders>
               <w:top w:val="single" w:sz="8" w:space="0" w:color="auto"/>
               <w:left w:val="single" w:sz="8" w:space="0" w:color="auto"/>
@@ -2026,7 +2176,7 @@
         </w:tc>
         <w:tc>
           <w:tcPr>
-            <w:tcW w:w="2974" w:type="dxa"/>
+            <w:tcW w:w="2330" w:type="dxa"/>
             <w:tcBorders>
               <w:top w:val="single" w:sz="8" w:space="0" w:color="auto"/>
               <w:left w:val="single" w:sz="8" w:space="0" w:color="auto"/>
@@ -2068,15 +2218,22 @@
         </w:trPr>
         <w:tc>
           <w:tcPr>
-            <w:tcW w:w="343" w:type="dxa"/>
+            <w:tcW w:w="265" w:type="dxa"/>
             <w:vMerge/>
+            <w:shd w:val="clear" w:color="auto" w:fill="CF3910"/>
             <w:vAlign w:val="center"/>
           </w:tcPr>
-          <w:p/>
-        </w:tc>
-        <w:tc>
-          <w:tcPr>
-            <w:tcW w:w="4691" w:type="dxa"/>
+          <w:p>
+            <w:pPr>
+              <w:rPr>
+                <w:color w:val="FFFFFF" w:themeColor="background1"/>
+              </w:rPr>
+            </w:pPr>
+          </w:p>
+        </w:tc>
+        <w:tc>
+          <w:tcPr>
+            <w:tcW w:w="6395" w:type="dxa"/>
             <w:gridSpan w:val="2"/>
             <w:vMerge/>
             <w:tcBorders>
@@ -2091,7 +2248,7 @@
         </w:tc>
         <w:tc>
           <w:tcPr>
-            <w:tcW w:w="3212" w:type="dxa"/>
+            <w:tcW w:w="2250" w:type="dxa"/>
             <w:tcBorders>
               <w:top w:val="nil"/>
               <w:left w:val="single" w:sz="8" w:space="0" w:color="auto"/>
@@ -2132,7 +2289,7 @@
         </w:tc>
         <w:tc>
           <w:tcPr>
-            <w:tcW w:w="2974" w:type="dxa"/>
+            <w:tcW w:w="2330" w:type="dxa"/>
             <w:tcBorders>
               <w:top w:val="nil"/>
               <w:left w:val="single" w:sz="8" w:space="0" w:color="auto"/>
@@ -2158,21 +2315,28 @@
         </w:trPr>
         <w:tc>
           <w:tcPr>
-            <w:tcW w:w="343" w:type="dxa"/>
+            <w:tcW w:w="265" w:type="dxa"/>
             <w:vMerge w:val="restart"/>
+            <w:shd w:val="clear" w:color="auto" w:fill="CF3910"/>
           </w:tcPr>
           <w:p>
             <w:pPr>
               <w:spacing w:line="210" w:lineRule="atLeast"/>
-            </w:pPr>
-            <w:r>
+              <w:rPr>
+                <w:color w:val="FFFFFF" w:themeColor="background1"/>
+              </w:rPr>
+            </w:pPr>
+            <w:r>
+              <w:rPr>
+                <w:color w:val="FFFFFF" w:themeColor="background1"/>
+              </w:rPr>
               <w:t> </w:t>
             </w:r>
           </w:p>
         </w:tc>
         <w:tc>
           <w:tcPr>
-            <w:tcW w:w="10877" w:type="dxa"/>
+            <w:tcW w:w="10975" w:type="dxa"/>
             <w:gridSpan w:val="4"/>
             <w:tcBorders>
               <w:top w:val="nil"/>
@@ -2246,15 +2410,22 @@
         </w:trPr>
         <w:tc>
           <w:tcPr>
-            <w:tcW w:w="343" w:type="dxa"/>
+            <w:tcW w:w="265" w:type="dxa"/>
             <w:vMerge/>
+            <w:shd w:val="clear" w:color="auto" w:fill="CF3910"/>
             <w:vAlign w:val="center"/>
           </w:tcPr>
-          <w:p/>
-        </w:tc>
-        <w:tc>
-          <w:tcPr>
-            <w:tcW w:w="10877" w:type="dxa"/>
+          <w:p>
+            <w:pPr>
+              <w:rPr>
+                <w:color w:val="FFFFFF" w:themeColor="background1"/>
+              </w:rPr>
+            </w:pPr>
+          </w:p>
+        </w:tc>
+        <w:tc>
+          <w:tcPr>
+            <w:tcW w:w="10975" w:type="dxa"/>
             <w:gridSpan w:val="4"/>
             <w:tcBorders>
               <w:top w:val="nil"/>
@@ -2342,33 +2513,27 @@
         </w:trPr>
         <w:tc>
           <w:tcPr>
-            <w:tcW w:w="343" w:type="dxa"/>
+            <w:tcW w:w="265" w:type="dxa"/>
             <w:tcBorders>
               <w:top w:val="single" w:sz="8" w:space="0" w:color="auto"/>
               <w:left w:val="nil"/>
               <w:bottom w:val="nil"/>
               <w:right w:val="nil"/>
             </w:tcBorders>
+            <w:shd w:val="clear" w:color="auto" w:fill="CF3910"/>
           </w:tcPr>
           <w:p>
             <w:pPr>
               <w:spacing w:line="192" w:lineRule="atLeast"/>
-            </w:pPr>
-            <w:r>
-              <w:rPr>
-                <w:rFonts w:ascii="Univers" w:hAnsi="Univers"/>
-                <w:b/>
-                <w:bCs/>
-                <w:sz w:val="18"/>
-                <w:szCs w:val="18"/>
-              </w:rPr>
-              <w:t>d.</w:t>
-            </w:r>
-          </w:p>
-        </w:tc>
-        <w:tc>
-          <w:tcPr>
-            <w:tcW w:w="4691" w:type="dxa"/>
+              <w:rPr>
+                <w:color w:val="FFFFFF" w:themeColor="background1"/>
+              </w:rPr>
+            </w:pPr>
+          </w:p>
+        </w:tc>
+        <w:tc>
+          <w:tcPr>
+            <w:tcW w:w="6395" w:type="dxa"/>
             <w:gridSpan w:val="2"/>
             <w:tcBorders>
               <w:top w:val="nil"/>
@@ -2404,7 +2569,7 @@
         </w:tc>
         <w:tc>
           <w:tcPr>
-            <w:tcW w:w="6186" w:type="dxa"/>
+            <w:tcW w:w="4580" w:type="dxa"/>
             <w:gridSpan w:val="2"/>
             <w:tcBorders>
               <w:top w:val="single" w:sz="8" w:space="0" w:color="auto"/>
@@ -2437,18 +2602,38 @@
         </w:trPr>
         <w:tc>
           <w:tcPr>
-            <w:tcW w:w="343" w:type="dxa"/>
+            <w:tcW w:w="265" w:type="dxa"/>
             <w:vMerge w:val="restart"/>
-          </w:tcPr>
-          <w:p>
-            <w:r>
+            <w:shd w:val="clear" w:color="auto" w:fill="CF3910"/>
+          </w:tcPr>
+          <w:p>
+            <w:pPr>
+              <w:rPr>
+                <w:color w:val="FFFFFF" w:themeColor="background1"/>
+              </w:rPr>
+            </w:pPr>
+            <w:r>
+              <w:rPr>
+                <w:color w:val="FFFFFF" w:themeColor="background1"/>
+              </w:rPr>
               <w:t> </w:t>
             </w:r>
-          </w:p>
-        </w:tc>
-        <w:tc>
-          <w:tcPr>
-            <w:tcW w:w="4691" w:type="dxa"/>
+            <w:r>
+              <w:rPr>
+                <w:rFonts w:ascii="Univers" w:hAnsi="Univers"/>
+                <w:b/>
+                <w:bCs/>
+                <w:color w:val="FFFFFF" w:themeColor="background1"/>
+                <w:sz w:val="18"/>
+                <w:szCs w:val="18"/>
+              </w:rPr>
+              <w:t>d.</w:t>
+            </w:r>
+          </w:p>
+        </w:tc>
+        <w:tc>
+          <w:tcPr>
+            <w:tcW w:w="6395" w:type="dxa"/>
             <w:gridSpan w:val="2"/>
             <w:vMerge w:val="restart"/>
             <w:tcBorders>
@@ -2564,7 +2749,7 @@
         </w:tc>
         <w:tc>
           <w:tcPr>
-            <w:tcW w:w="3212" w:type="dxa"/>
+            <w:tcW w:w="2250" w:type="dxa"/>
             <w:tcBorders>
               <w:top w:val="nil"/>
               <w:left w:val="single" w:sz="8" w:space="0" w:color="auto"/>
@@ -2589,7 +2774,7 @@
         </w:tc>
         <w:tc>
           <w:tcPr>
-            <w:tcW w:w="2974" w:type="dxa"/>
+            <w:tcW w:w="2330" w:type="dxa"/>
             <w:tcBorders>
               <w:top w:val="single" w:sz="8" w:space="0" w:color="auto"/>
               <w:left w:val="single" w:sz="8" w:space="0" w:color="auto"/>
@@ -2630,15 +2815,22 @@
         </w:trPr>
         <w:tc>
           <w:tcPr>
-            <w:tcW w:w="343" w:type="dxa"/>
+            <w:tcW w:w="265" w:type="dxa"/>
             <w:vMerge/>
+            <w:shd w:val="clear" w:color="auto" w:fill="CF3910"/>
             <w:vAlign w:val="center"/>
           </w:tcPr>
-          <w:p/>
-        </w:tc>
-        <w:tc>
-          <w:tcPr>
-            <w:tcW w:w="4691" w:type="dxa"/>
+          <w:p>
+            <w:pPr>
+              <w:rPr>
+                <w:color w:val="FFFFFF" w:themeColor="background1"/>
+              </w:rPr>
+            </w:pPr>
+          </w:p>
+        </w:tc>
+        <w:tc>
+          <w:tcPr>
+            <w:tcW w:w="6395" w:type="dxa"/>
             <w:gridSpan w:val="2"/>
             <w:vMerge/>
             <w:tcBorders>
@@ -2665,7 +2857,7 @@
         </w:tc>
         <w:tc>
           <w:tcPr>
-            <w:tcW w:w="3212" w:type="dxa"/>
+            <w:tcW w:w="2250" w:type="dxa"/>
             <w:tcBorders>
               <w:top w:val="nil"/>
               <w:left w:val="single" w:sz="8" w:space="0" w:color="auto"/>
@@ -2715,7 +2907,7 @@
         </w:tc>
         <w:tc>
           <w:tcPr>
-            <w:tcW w:w="2974" w:type="dxa"/>
+            <w:tcW w:w="2330" w:type="dxa"/>
             <w:tcBorders>
               <w:top w:val="nil"/>
               <w:left w:val="single" w:sz="8" w:space="0" w:color="auto"/>
@@ -2741,18 +2933,27 @@
         </w:trPr>
         <w:tc>
           <w:tcPr>
-            <w:tcW w:w="343" w:type="dxa"/>
+            <w:tcW w:w="265" w:type="dxa"/>
             <w:vMerge w:val="restart"/>
-          </w:tcPr>
-          <w:p>
-            <w:r>
+            <w:shd w:val="clear" w:color="auto" w:fill="CF3910"/>
+          </w:tcPr>
+          <w:p>
+            <w:pPr>
+              <w:rPr>
+                <w:color w:val="FFFFFF" w:themeColor="background1"/>
+              </w:rPr>
+            </w:pPr>
+            <w:r>
+              <w:rPr>
+                <w:color w:val="FFFFFF" w:themeColor="background1"/>
+              </w:rPr>
               <w:t> </w:t>
             </w:r>
           </w:p>
         </w:tc>
         <w:tc>
           <w:tcPr>
-            <w:tcW w:w="10877" w:type="dxa"/>
+            <w:tcW w:w="10975" w:type="dxa"/>
             <w:gridSpan w:val="4"/>
             <w:tcBorders>
               <w:top w:val="nil"/>
@@ -2831,15 +3032,22 @@
         </w:trPr>
         <w:tc>
           <w:tcPr>
-            <w:tcW w:w="343" w:type="dxa"/>
+            <w:tcW w:w="265" w:type="dxa"/>
             <w:vMerge/>
+            <w:shd w:val="clear" w:color="auto" w:fill="CF3910"/>
             <w:vAlign w:val="center"/>
           </w:tcPr>
-          <w:p/>
-        </w:tc>
-        <w:tc>
-          <w:tcPr>
-            <w:tcW w:w="10877" w:type="dxa"/>
+          <w:p>
+            <w:pPr>
+              <w:rPr>
+                <w:color w:val="FFFFFF" w:themeColor="background1"/>
+              </w:rPr>
+            </w:pPr>
+          </w:p>
+        </w:tc>
+        <w:tc>
+          <w:tcPr>
+            <w:tcW w:w="10975" w:type="dxa"/>
             <w:gridSpan w:val="4"/>
             <w:tcBorders>
               <w:top w:val="nil"/>
@@ -2938,33 +3146,27 @@
         </w:trPr>
         <w:tc>
           <w:tcPr>
-            <w:tcW w:w="343" w:type="dxa"/>
+            <w:tcW w:w="265" w:type="dxa"/>
             <w:tcBorders>
               <w:top w:val="single" w:sz="8" w:space="0" w:color="auto"/>
               <w:left w:val="nil"/>
               <w:bottom w:val="nil"/>
               <w:right w:val="nil"/>
             </w:tcBorders>
+            <w:shd w:val="clear" w:color="auto" w:fill="CF3910"/>
           </w:tcPr>
           <w:p>
             <w:pPr>
               <w:spacing w:line="192" w:lineRule="atLeast"/>
-            </w:pPr>
-            <w:r>
-              <w:rPr>
-                <w:rFonts w:ascii="Univers" w:hAnsi="Univers"/>
-                <w:b/>
-                <w:bCs/>
-                <w:sz w:val="18"/>
-                <w:szCs w:val="18"/>
-              </w:rPr>
-              <w:t>e.</w:t>
-            </w:r>
-          </w:p>
-        </w:tc>
-        <w:tc>
-          <w:tcPr>
-            <w:tcW w:w="4691" w:type="dxa"/>
+              <w:rPr>
+                <w:color w:val="FFFFFF" w:themeColor="background1"/>
+              </w:rPr>
+            </w:pPr>
+          </w:p>
+        </w:tc>
+        <w:tc>
+          <w:tcPr>
+            <w:tcW w:w="6395" w:type="dxa"/>
             <w:gridSpan w:val="2"/>
             <w:tcBorders>
               <w:top w:val="nil"/>
@@ -3000,7 +3202,7 @@
         </w:tc>
         <w:tc>
           <w:tcPr>
-            <w:tcW w:w="6186" w:type="dxa"/>
+            <w:tcW w:w="4580" w:type="dxa"/>
             <w:gridSpan w:val="2"/>
             <w:tcBorders>
               <w:top w:val="single" w:sz="8" w:space="0" w:color="auto"/>
@@ -3033,8 +3235,9 @@
         </w:trPr>
         <w:tc>
           <w:tcPr>
-            <w:tcW w:w="343" w:type="dxa"/>
+            <w:tcW w:w="265" w:type="dxa"/>
             <w:vMerge w:val="restart"/>
+            <w:shd w:val="clear" w:color="auto" w:fill="CF3910"/>
           </w:tcPr>
           <w:p>
             <w:pPr>
@@ -3043,11 +3246,33 @@
             <w:r>
               <w:t> </w:t>
             </w:r>
-          </w:p>
-        </w:tc>
-        <w:tc>
-          <w:tcPr>
-            <w:tcW w:w="4691" w:type="dxa"/>
+            <w:r>
+              <w:rPr>
+                <w:rFonts w:ascii="Univers" w:hAnsi="Univers"/>
+                <w:b/>
+                <w:bCs/>
+                <w:color w:val="FFFFFF" w:themeColor="background1"/>
+                <w:sz w:val="18"/>
+                <w:szCs w:val="18"/>
+              </w:rPr>
+              <w:t>e</w:t>
+            </w:r>
+            <w:r>
+              <w:rPr>
+                <w:rFonts w:ascii="Univers" w:hAnsi="Univers"/>
+                <w:b/>
+                <w:bCs/>
+                <w:color w:val="FFFFFF" w:themeColor="background1"/>
+                <w:sz w:val="18"/>
+                <w:szCs w:val="18"/>
+              </w:rPr>
+              <w:t>.</w:t>
+            </w:r>
+          </w:p>
+        </w:tc>
+        <w:tc>
+          <w:tcPr>
+            <w:tcW w:w="6395" w:type="dxa"/>
             <w:gridSpan w:val="2"/>
             <w:vMerge w:val="restart"/>
             <w:tcBorders>
@@ -3127,7 +3352,7 @@
         </w:tc>
         <w:tc>
           <w:tcPr>
-            <w:tcW w:w="3212" w:type="dxa"/>
+            <w:tcW w:w="2250" w:type="dxa"/>
             <w:tcBorders>
               <w:top w:val="single" w:sz="8" w:space="0" w:color="auto"/>
               <w:left w:val="single" w:sz="8" w:space="0" w:color="auto"/>
@@ -3153,7 +3378,7 @@
         </w:tc>
         <w:tc>
           <w:tcPr>
-            <w:tcW w:w="2974" w:type="dxa"/>
+            <w:tcW w:w="2330" w:type="dxa"/>
             <w:tcBorders>
               <w:top w:val="single" w:sz="8" w:space="0" w:color="auto"/>
               <w:left w:val="single" w:sz="8" w:space="0" w:color="auto"/>
@@ -3195,15 +3420,16 @@
         </w:trPr>
         <w:tc>
           <w:tcPr>
-            <w:tcW w:w="343" w:type="dxa"/>
+            <w:tcW w:w="265" w:type="dxa"/>
             <w:vMerge/>
+            <w:shd w:val="clear" w:color="auto" w:fill="CF3910"/>
             <w:vAlign w:val="center"/>
           </w:tcPr>
           <w:p/>
         </w:tc>
         <w:tc>
           <w:tcPr>
-            <w:tcW w:w="4691" w:type="dxa"/>
+            <w:tcW w:w="6395" w:type="dxa"/>
             <w:gridSpan w:val="2"/>
             <w:vMerge/>
             <w:tcBorders>
@@ -3228,7 +3454,7 @@
         </w:tc>
         <w:tc>
           <w:tcPr>
-            <w:tcW w:w="3212" w:type="dxa"/>
+            <w:tcW w:w="2250" w:type="dxa"/>
             <w:tcBorders>
               <w:top w:val="nil"/>
               <w:left w:val="single" w:sz="8" w:space="0" w:color="auto"/>
@@ -3279,7 +3505,7 @@
         </w:tc>
         <w:tc>
           <w:tcPr>
-            <w:tcW w:w="2974" w:type="dxa"/>
+            <w:tcW w:w="2330" w:type="dxa"/>
             <w:tcBorders>
               <w:top w:val="nil"/>
               <w:left w:val="single" w:sz="8" w:space="0" w:color="auto"/>
@@ -3306,7 +3532,7 @@
         </w:trPr>
         <w:tc>
           <w:tcPr>
-            <w:tcW w:w="343" w:type="dxa"/>
+            <w:tcW w:w="265" w:type="dxa"/>
             <w:vMerge w:val="restart"/>
             <w:tcBorders>
               <w:top w:val="nil"/>
@@ -3314,6 +3540,7 @@
               <w:bottom w:val="single" w:sz="8" w:space="0" w:color="auto"/>
               <w:right w:val="nil"/>
             </w:tcBorders>
+            <w:shd w:val="clear" w:color="auto" w:fill="CF3910"/>
           </w:tcPr>
           <w:p>
             <w:r>
@@ -3323,7 +3550,7 @@
         </w:tc>
         <w:tc>
           <w:tcPr>
-            <w:tcW w:w="10877" w:type="dxa"/>
+            <w:tcW w:w="10975" w:type="dxa"/>
             <w:gridSpan w:val="4"/>
             <w:tcBorders>
               <w:top w:val="nil"/>
@@ -3402,7 +3629,7 @@
         </w:trPr>
         <w:tc>
           <w:tcPr>
-            <w:tcW w:w="343" w:type="dxa"/>
+            <w:tcW w:w="265" w:type="dxa"/>
             <w:vMerge/>
             <w:tcBorders>
               <w:top w:val="nil"/>
@@ -3410,13 +3637,14 @@
               <w:bottom w:val="single" w:sz="8" w:space="0" w:color="auto"/>
               <w:right w:val="nil"/>
             </w:tcBorders>
+            <w:shd w:val="clear" w:color="auto" w:fill="CF3910"/>
             <w:vAlign w:val="center"/>
           </w:tcPr>
           <w:p/>
         </w:tc>
         <w:tc>
           <w:tcPr>
-            <w:tcW w:w="10877" w:type="dxa"/>
+            <w:tcW w:w="10975" w:type="dxa"/>
             <w:gridSpan w:val="4"/>
             <w:tcBorders>
               <w:top w:val="nil"/>
@@ -3511,7 +3739,7 @@
       <w:tr>
         <w:tc>
           <w:tcPr>
-            <w:tcW w:w="343" w:type="dxa"/>
+            <w:tcW w:w="265" w:type="dxa"/>
             <w:tcBorders>
               <w:top w:val="nil"/>
               <w:left w:val="nil"/>
@@ -3530,7 +3758,7 @@
         </w:tc>
         <w:tc>
           <w:tcPr>
-            <w:tcW w:w="2537" w:type="dxa"/>
+            <w:tcW w:w="3428" w:type="dxa"/>
             <w:tcBorders>
               <w:top w:val="nil"/>
               <w:left w:val="nil"/>
@@ -3549,7 +3777,7 @@
         </w:tc>
         <w:tc>
           <w:tcPr>
-            <w:tcW w:w="2154" w:type="dxa"/>
+            <w:tcW w:w="2967" w:type="dxa"/>
             <w:tcBorders>
               <w:top w:val="nil"/>
               <w:left w:val="nil"/>
@@ -3568,7 +3796,7 @@
         </w:tc>
         <w:tc>
           <w:tcPr>
-            <w:tcW w:w="3212" w:type="dxa"/>
+            <w:tcW w:w="2250" w:type="dxa"/>
             <w:tcBorders>
               <w:top w:val="nil"/>
               <w:left w:val="nil"/>
@@ -3587,7 +3815,7 @@
         </w:tc>
         <w:tc>
           <w:tcPr>
-            <w:tcW w:w="2974" w:type="dxa"/>
+            <w:tcW w:w="2330" w:type="dxa"/>
             <w:tcBorders>
               <w:top w:val="nil"/>
               <w:left w:val="nil"/>
@@ -3616,14 +3844,9 @@
       </w:pPr>
     </w:p>
     <w:sectPr>
-      <w:headerReference w:type="even" r:id="rId10"/>
-      <w:headerReference w:type="default" r:id="rId11"/>
-      <w:footerReference w:type="even" r:id="rId12"/>
-      <w:footerReference w:type="default" r:id="rId13"/>
-      <w:headerReference w:type="first" r:id="rId14"/>
-      <w:footerReference w:type="first" r:id="rId15"/>
+      <w:footerReference w:type="default" r:id="rId10"/>
       <w:pgSz w:w="12240" w:h="15840"/>
-      <w:pgMar w:top="1440" w:right="1800" w:bottom="1440" w:left="1800" w:header="288" w:footer="720" w:gutter="0"/>
+      <w:pgMar w:top="864" w:right="1800" w:bottom="720" w:left="1800" w:header="288" w:footer="432" w:gutter="0"/>
       <w:pgNumType w:start="3"/>
       <w:cols w:space="720"/>
       <w:docGrid w:linePitch="360"/>
@@ -3653,16 +3876,6 @@
 
 <file path=word/footer1.xml><?xml version="1.0" encoding="utf-8"?>
 <w:ftr xmlns:wpc="http://schemas.microsoft.com/office/word/2010/wordprocessingCanvas" xmlns:cx="http://schemas.microsoft.com/office/drawing/2014/chartex" xmlns:cx1="http://schemas.microsoft.com/office/drawing/2015/9/8/chartex" xmlns:cx2="http://schemas.microsoft.com/office/drawing/2015/10/21/chartex" xmlns:cx3="http://schemas.microsoft.com/office/drawing/2016/5/9/chartex" xmlns:cx4="http://schemas.microsoft.com/office/drawing/2016/5/10/chartex" xmlns:cx5="http://schemas.microsoft.com/office/drawing/2016/5/11/chartex" xmlns:cx6="http://schemas.microsoft.com/office/drawing/2016/5/12/chartex" xmlns:cx7="http://schemas.microsoft.com/office/drawing/2016/5/13/chartex" xmlns:cx8="http://schemas.microsoft.com/office/drawing/2016/5/14/chartex" xmlns:mc="http://schemas.openxmlformats.org/markup-compatibility/2006" xmlns:aink="http://schemas.microsoft.com/office/drawing/2016/ink" xmlns:am3d="http://schemas.microsoft.com/office/drawing/2017/model3d" xmlns:o="urn:schemas-microsoft-com:office:office" xmlns:oel="http://schemas.microsoft.com/office/2019/extlst" xmlns:r="http://schemas.openxmlformats.org/officeDocument/2006/relationships" xmlns:m="http://schemas.openxmlformats.org/officeDocument/2006/math" xmlns:v="urn:schemas-microsoft-com:vml" xmlns:wp14="http://schemas.microsoft.com/office/word/2010/wordprocessingDrawing" xmlns:wp="http://schemas.openxmlformats.org/drawingml/2006/wordprocessingDrawing" xmlns:w10="urn:schemas-microsoft-com:office:word" xmlns:w="http://schemas.openxmlformats.org/wordprocessingml/2006/main" xmlns:w14="http://schemas.microsoft.com/office/word/2010/wordml" xmlns:w15="http://schemas.microsoft.com/office/word/2012/wordml" xmlns:w16cex="http://schemas.microsoft.com/office/word/2018/wordml/cex" xmlns:w16cid="http://schemas.microsoft.com/office/word/2016/wordml/cid" xmlns:w16="http://schemas.microsoft.com/office/word/2018/wordml" xmlns:w16du="http://schemas.microsoft.com/office/word/2023/wordml/word16du" xmlns:w16sdtdh="http://schemas.microsoft.com/office/word/2020/wordml/sdtdatahash" xmlns:w16sdtfl="http://schemas.microsoft.com/office/word/2024/wordml/sdtformatlock" xmlns:w16se="http://schemas.microsoft.com/office/word/2015/wordml/symex" xmlns:wpg="http://schemas.microsoft.com/office/word/2010/wordprocessingGroup" xmlns:wpi="http://schemas.microsoft.com/office/word/2010/wordprocessingInk" xmlns:wne="http://schemas.microsoft.com/office/word/2006/wordml" xmlns:wps="http://schemas.microsoft.com/office/word/2010/wordprocessingShape" mc:Ignorable="w14 w15 w16se w16cid w16 w16cex w16sdtdh w16sdtfl w16du wp14">
-  <w:p>
-    <w:pPr>
-      <w:pStyle w:val="Footer"/>
-    </w:pPr>
-  </w:p>
-</w:ftr>
-</file>
-
-<file path=word/footer2.xml><?xml version="1.0" encoding="utf-8"?>
-<w:ftr xmlns:wpc="http://schemas.microsoft.com/office/word/2010/wordprocessingCanvas" xmlns:cx="http://schemas.microsoft.com/office/drawing/2014/chartex" xmlns:cx1="http://schemas.microsoft.com/office/drawing/2015/9/8/chartex" xmlns:cx2="http://schemas.microsoft.com/office/drawing/2015/10/21/chartex" xmlns:cx3="http://schemas.microsoft.com/office/drawing/2016/5/9/chartex" xmlns:cx4="http://schemas.microsoft.com/office/drawing/2016/5/10/chartex" xmlns:cx5="http://schemas.microsoft.com/office/drawing/2016/5/11/chartex" xmlns:cx6="http://schemas.microsoft.com/office/drawing/2016/5/12/chartex" xmlns:cx7="http://schemas.microsoft.com/office/drawing/2016/5/13/chartex" xmlns:cx8="http://schemas.microsoft.com/office/drawing/2016/5/14/chartex" xmlns:mc="http://schemas.openxmlformats.org/markup-compatibility/2006" xmlns:aink="http://schemas.microsoft.com/office/drawing/2016/ink" xmlns:am3d="http://schemas.microsoft.com/office/drawing/2017/model3d" xmlns:o="urn:schemas-microsoft-com:office:office" xmlns:oel="http://schemas.microsoft.com/office/2019/extlst" xmlns:r="http://schemas.openxmlformats.org/officeDocument/2006/relationships" xmlns:m="http://schemas.openxmlformats.org/officeDocument/2006/math" xmlns:v="urn:schemas-microsoft-com:vml" xmlns:wp14="http://schemas.microsoft.com/office/word/2010/wordprocessingDrawing" xmlns:wp="http://schemas.openxmlformats.org/drawingml/2006/wordprocessingDrawing" xmlns:w10="urn:schemas-microsoft-com:office:word" xmlns:w="http://schemas.openxmlformats.org/wordprocessingml/2006/main" xmlns:w14="http://schemas.microsoft.com/office/word/2010/wordml" xmlns:w15="http://schemas.microsoft.com/office/word/2012/wordml" xmlns:w16cex="http://schemas.microsoft.com/office/word/2018/wordml/cex" xmlns:w16cid="http://schemas.microsoft.com/office/word/2016/wordml/cid" xmlns:w16="http://schemas.microsoft.com/office/word/2018/wordml" xmlns:w16du="http://schemas.microsoft.com/office/word/2023/wordml/word16du" xmlns:w16sdtdh="http://schemas.microsoft.com/office/word/2020/wordml/sdtdatahash" xmlns:w16sdtfl="http://schemas.microsoft.com/office/word/2024/wordml/sdtformatlock" xmlns:w16se="http://schemas.microsoft.com/office/word/2015/wordml/symex" xmlns:wpg="http://schemas.microsoft.com/office/word/2010/wordprocessingGroup" xmlns:wpi="http://schemas.microsoft.com/office/word/2010/wordprocessingInk" xmlns:wne="http://schemas.microsoft.com/office/word/2006/wordml" xmlns:wps="http://schemas.microsoft.com/office/word/2010/wordprocessingShape" mc:Ignorable="w14 w15 w16se w16cid w16 w16cex w16sdtdh w16sdtfl w16du wp14">
   <w:tbl>
     <w:tblPr>
       <w:tblW w:w="11250" w:type="dxa"/>
@@ -3690,6 +3903,73 @@
               <w:sz w:val="22"/>
             </w:rPr>
           </w:pPr>
+          <w:r>
+            <w:rPr>
+              <w:noProof/>
+            </w:rPr>
+            <w:drawing>
+              <wp:anchor distT="0" distB="0" distL="114300" distR="114300" simplePos="0" relativeHeight="251658240" behindDoc="1" locked="0" layoutInCell="1" allowOverlap="1" wp14:anchorId="0AC81792" wp14:editId="7240665F">
+                <wp:simplePos x="0" y="0"/>
+                <wp:positionH relativeFrom="column">
+                  <wp:posOffset>-51435</wp:posOffset>
+                </wp:positionH>
+                <wp:positionV relativeFrom="paragraph">
+                  <wp:posOffset>57150</wp:posOffset>
+                </wp:positionV>
+                <wp:extent cx="1547817" cy="190500"/>
+                <wp:effectExtent l="0" t="0" r="0" b="0"/>
+                <wp:wrapNone/>
+                <wp:docPr id="1" name="Picture 1"/>
+                <wp:cNvGraphicFramePr>
+                  <a:graphicFrameLocks xmlns:a="http://schemas.openxmlformats.org/drawingml/2006/main" noChangeAspect="1"/>
+                </wp:cNvGraphicFramePr>
+                <a:graphic xmlns:a="http://schemas.openxmlformats.org/drawingml/2006/main">
+                  <a:graphicData uri="http://schemas.openxmlformats.org/drawingml/2006/picture">
+                    <pic:pic xmlns:pic="http://schemas.openxmlformats.org/drawingml/2006/picture">
+                      <pic:nvPicPr>
+                        <pic:cNvPr id="0" name="Picture 1"/>
+                        <pic:cNvPicPr>
+                          <a:picLocks noChangeAspect="1" noChangeArrowheads="1"/>
+                        </pic:cNvPicPr>
+                      </pic:nvPicPr>
+                      <pic:blipFill>
+                        <a:blip r:embed="rId1">
+                          <a:extLst>
+                            <a:ext uri="{28A0092B-C50C-407E-A947-70E740481C1C}">
+                              <a14:useLocalDpi xmlns:a14="http://schemas.microsoft.com/office/drawing/2010/main" val="0"/>
+                            </a:ext>
+                          </a:extLst>
+                        </a:blip>
+                        <a:srcRect/>
+                        <a:stretch>
+                          <a:fillRect/>
+                        </a:stretch>
+                      </pic:blipFill>
+                      <pic:spPr bwMode="auto">
+                        <a:xfrm>
+                          <a:off x="0" y="0"/>
+                          <a:ext cx="1567435" cy="192915"/>
+                        </a:xfrm>
+                        <a:prstGeom prst="rect">
+                          <a:avLst/>
+                        </a:prstGeom>
+                        <a:noFill/>
+                        <a:ln>
+                          <a:noFill/>
+                        </a:ln>
+                      </pic:spPr>
+                    </pic:pic>
+                  </a:graphicData>
+                </a:graphic>
+                <wp14:sizeRelH relativeFrom="margin">
+                  <wp14:pctWidth>0</wp14:pctWidth>
+                </wp14:sizeRelH>
+                <wp14:sizeRelV relativeFrom="margin">
+                  <wp14:pctHeight>0</wp14:pctHeight>
+                </wp14:sizeRelV>
+              </wp:anchor>
+            </w:drawing>
+          </w:r>
           <w:r>
             <w:rPr>
               <w:rFonts w:ascii="Arial" w:hAnsi="Arial"/>
@@ -3762,22 +4042,40 @@
   <w:p>
     <w:pPr>
       <w:pStyle w:val="Footer"/>
+      <w:tabs>
+        <w:tab w:val="left" w:pos="2145"/>
+        <w:tab w:val="left" w:pos="2655"/>
+      </w:tabs>
       <w:spacing w:before="0" w:beforeAutospacing="0" w:after="0" w:afterAutospacing="0"/>
       <w:rPr>
         <w:sz w:val="12"/>
         <w:szCs w:val="12"/>
       </w:rPr>
     </w:pPr>
-  </w:p>
-</w:ftr>
-</file>
-
-<file path=word/footer3.xml><?xml version="1.0" encoding="utf-8"?>
-<w:ftr xmlns:wpc="http://schemas.microsoft.com/office/word/2010/wordprocessingCanvas" xmlns:cx="http://schemas.microsoft.com/office/drawing/2014/chartex" xmlns:cx1="http://schemas.microsoft.com/office/drawing/2015/9/8/chartex" xmlns:cx2="http://schemas.microsoft.com/office/drawing/2015/10/21/chartex" xmlns:cx3="http://schemas.microsoft.com/office/drawing/2016/5/9/chartex" xmlns:cx4="http://schemas.microsoft.com/office/drawing/2016/5/10/chartex" xmlns:cx5="http://schemas.microsoft.com/office/drawing/2016/5/11/chartex" xmlns:cx6="http://schemas.microsoft.com/office/drawing/2016/5/12/chartex" xmlns:cx7="http://schemas.microsoft.com/office/drawing/2016/5/13/chartex" xmlns:cx8="http://schemas.microsoft.com/office/drawing/2016/5/14/chartex" xmlns:mc="http://schemas.openxmlformats.org/markup-compatibility/2006" xmlns:aink="http://schemas.microsoft.com/office/drawing/2016/ink" xmlns:am3d="http://schemas.microsoft.com/office/drawing/2017/model3d" xmlns:o="urn:schemas-microsoft-com:office:office" xmlns:oel="http://schemas.microsoft.com/office/2019/extlst" xmlns:r="http://schemas.openxmlformats.org/officeDocument/2006/relationships" xmlns:m="http://schemas.openxmlformats.org/officeDocument/2006/math" xmlns:v="urn:schemas-microsoft-com:vml" xmlns:wp14="http://schemas.microsoft.com/office/word/2010/wordprocessingDrawing" xmlns:wp="http://schemas.openxmlformats.org/drawingml/2006/wordprocessingDrawing" xmlns:w10="urn:schemas-microsoft-com:office:word" xmlns:w="http://schemas.openxmlformats.org/wordprocessingml/2006/main" xmlns:w14="http://schemas.microsoft.com/office/word/2010/wordml" xmlns:w15="http://schemas.microsoft.com/office/word/2012/wordml" xmlns:w16cex="http://schemas.microsoft.com/office/word/2018/wordml/cex" xmlns:w16cid="http://schemas.microsoft.com/office/word/2016/wordml/cid" xmlns:w16="http://schemas.microsoft.com/office/word/2018/wordml" xmlns:w16du="http://schemas.microsoft.com/office/word/2023/wordml/word16du" xmlns:w16sdtdh="http://schemas.microsoft.com/office/word/2020/wordml/sdtdatahash" xmlns:w16sdtfl="http://schemas.microsoft.com/office/word/2024/wordml/sdtformatlock" xmlns:w16se="http://schemas.microsoft.com/office/word/2015/wordml/symex" xmlns:wpg="http://schemas.microsoft.com/office/word/2010/wordprocessingGroup" xmlns:wpi="http://schemas.microsoft.com/office/word/2010/wordprocessingInk" xmlns:wne="http://schemas.microsoft.com/office/word/2006/wordml" xmlns:wps="http://schemas.microsoft.com/office/word/2010/wordprocessingShape" mc:Ignorable="w14 w15 w16se w16cid w16 w16cex w16sdtdh w16sdtfl w16du wp14">
-  <w:p>
-    <w:pPr>
-      <w:pStyle w:val="Footer"/>
-    </w:pPr>
+    <w:r>
+      <w:rPr>
+        <w:noProof/>
+      </w:rPr>
+      <w:ptab w:relativeTo="margin" w:alignment="left" w:leader="none"/>
+    </w:r>
+    <w:r>
+      <w:rPr>
+        <w:noProof/>
+      </w:rPr>
+      <w:ptab w:relativeTo="indent" w:alignment="left" w:leader="none"/>
+    </w:r>
+    <w:r>
+      <w:rPr>
+        <w:noProof/>
+      </w:rPr>
+      <w:tab/>
+    </w:r>
+    <w:r>
+      <w:rPr>
+        <w:noProof/>
+      </w:rPr>
+      <w:tab/>
+    </w:r>
   </w:p>
 </w:ftr>
 </file>
@@ -3799,90 +4097,6 @@
     </w:p>
   </w:footnote>
 </w:footnotes>
-</file>
-
-<file path=word/header1.xml><?xml version="1.0" encoding="utf-8"?>
-<w:hdr xmlns:wpc="http://schemas.microsoft.com/office/word/2010/wordprocessingCanvas" xmlns:cx="http://schemas.microsoft.com/office/drawing/2014/chartex" xmlns:cx1="http://schemas.microsoft.com/office/drawing/2015/9/8/chartex" xmlns:cx2="http://schemas.microsoft.com/office/drawing/2015/10/21/chartex" xmlns:cx3="http://schemas.microsoft.com/office/drawing/2016/5/9/chartex" xmlns:cx4="http://schemas.microsoft.com/office/drawing/2016/5/10/chartex" xmlns:cx5="http://schemas.microsoft.com/office/drawing/2016/5/11/chartex" xmlns:cx6="http://schemas.microsoft.com/office/drawing/2016/5/12/chartex" xmlns:cx7="http://schemas.microsoft.com/office/drawing/2016/5/13/chartex" xmlns:cx8="http://schemas.microsoft.com/office/drawing/2016/5/14/chartex" xmlns:mc="http://schemas.openxmlformats.org/markup-compatibility/2006" xmlns:aink="http://schemas.microsoft.com/office/drawing/2016/ink" xmlns:am3d="http://schemas.microsoft.com/office/drawing/2017/model3d" xmlns:o="urn:schemas-microsoft-com:office:office" xmlns:oel="http://schemas.microsoft.com/office/2019/extlst" xmlns:r="http://schemas.openxmlformats.org/officeDocument/2006/relationships" xmlns:m="http://schemas.openxmlformats.org/officeDocument/2006/math" xmlns:v="urn:schemas-microsoft-com:vml" xmlns:wp14="http://schemas.microsoft.com/office/word/2010/wordprocessingDrawing" xmlns:wp="http://schemas.openxmlformats.org/drawingml/2006/wordprocessingDrawing" xmlns:w10="urn:schemas-microsoft-com:office:word" xmlns:w="http://schemas.openxmlformats.org/wordprocessingml/2006/main" xmlns:w14="http://schemas.microsoft.com/office/word/2010/wordml" xmlns:w15="http://schemas.microsoft.com/office/word/2012/wordml" xmlns:w16cex="http://schemas.microsoft.com/office/word/2018/wordml/cex" xmlns:w16cid="http://schemas.microsoft.com/office/word/2016/wordml/cid" xmlns:w16="http://schemas.microsoft.com/office/word/2018/wordml" xmlns:w16du="http://schemas.microsoft.com/office/word/2023/wordml/word16du" xmlns:w16sdtdh="http://schemas.microsoft.com/office/word/2020/wordml/sdtdatahash" xmlns:w16sdtfl="http://schemas.microsoft.com/office/word/2024/wordml/sdtformatlock" xmlns:w16se="http://schemas.microsoft.com/office/word/2015/wordml/symex" xmlns:wpg="http://schemas.microsoft.com/office/word/2010/wordprocessingGroup" xmlns:wpi="http://schemas.microsoft.com/office/word/2010/wordprocessingInk" xmlns:wne="http://schemas.microsoft.com/office/word/2006/wordml" xmlns:wps="http://schemas.microsoft.com/office/word/2010/wordprocessingShape" mc:Ignorable="w14 w15 w16se w16cid w16 w16cex w16sdtdh w16sdtfl w16du wp14">
-  <w:p>
-    <w:pPr>
-      <w:pStyle w:val="Header"/>
-    </w:pPr>
-  </w:p>
-</w:hdr>
-</file>
-
-<file path=word/header2.xml><?xml version="1.0" encoding="utf-8"?>
-<w:hdr xmlns:wpc="http://schemas.microsoft.com/office/word/2010/wordprocessingCanvas" xmlns:cx="http://schemas.microsoft.com/office/drawing/2014/chartex" xmlns:cx1="http://schemas.microsoft.com/office/drawing/2015/9/8/chartex" xmlns:cx2="http://schemas.microsoft.com/office/drawing/2015/10/21/chartex" xmlns:cx3="http://schemas.microsoft.com/office/drawing/2016/5/9/chartex" xmlns:cx4="http://schemas.microsoft.com/office/drawing/2016/5/10/chartex" xmlns:cx5="http://schemas.microsoft.com/office/drawing/2016/5/11/chartex" xmlns:cx6="http://schemas.microsoft.com/office/drawing/2016/5/12/chartex" xmlns:cx7="http://schemas.microsoft.com/office/drawing/2016/5/13/chartex" xmlns:cx8="http://schemas.microsoft.com/office/drawing/2016/5/14/chartex" xmlns:mc="http://schemas.openxmlformats.org/markup-compatibility/2006" xmlns:aink="http://schemas.microsoft.com/office/drawing/2016/ink" xmlns:am3d="http://schemas.microsoft.com/office/drawing/2017/model3d" xmlns:o="urn:schemas-microsoft-com:office:office" xmlns:oel="http://schemas.microsoft.com/office/2019/extlst" xmlns:r="http://schemas.openxmlformats.org/officeDocument/2006/relationships" xmlns:m="http://schemas.openxmlformats.org/officeDocument/2006/math" xmlns:v="urn:schemas-microsoft-com:vml" xmlns:wp14="http://schemas.microsoft.com/office/word/2010/wordprocessingDrawing" xmlns:wp="http://schemas.openxmlformats.org/drawingml/2006/wordprocessingDrawing" xmlns:w10="urn:schemas-microsoft-com:office:word" xmlns:w="http://schemas.openxmlformats.org/wordprocessingml/2006/main" xmlns:w14="http://schemas.microsoft.com/office/word/2010/wordml" xmlns:w15="http://schemas.microsoft.com/office/word/2012/wordml" xmlns:w16cex="http://schemas.microsoft.com/office/word/2018/wordml/cex" xmlns:w16cid="http://schemas.microsoft.com/office/word/2016/wordml/cid" xmlns:w16="http://schemas.microsoft.com/office/word/2018/wordml" xmlns:w16du="http://schemas.microsoft.com/office/word/2023/wordml/word16du" xmlns:w16sdtdh="http://schemas.microsoft.com/office/word/2020/wordml/sdtdatahash" xmlns:w16sdtfl="http://schemas.microsoft.com/office/word/2024/wordml/sdtformatlock" xmlns:w16se="http://schemas.microsoft.com/office/word/2015/wordml/symex" xmlns:wpg="http://schemas.microsoft.com/office/word/2010/wordprocessingGroup" xmlns:wpi="http://schemas.microsoft.com/office/word/2010/wordprocessingInk" xmlns:wne="http://schemas.microsoft.com/office/word/2006/wordml" xmlns:wps="http://schemas.microsoft.com/office/word/2010/wordprocessingShape" mc:Ignorable="w14 w15 w16se w16cid w16 w16cex w16sdtdh w16sdtfl w16du wp14">
-  <w:p>
-    <w:pPr>
-      <w:pStyle w:val="Header"/>
-      <w:jc w:val="center"/>
-    </w:pPr>
-    <w:r>
-      <w:rPr>
-        <w:noProof/>
-      </w:rPr>
-      <w:drawing>
-        <wp:inline distT="0" distB="0" distL="0" distR="0" wp14:anchorId="154CD230" wp14:editId="6EE93B58">
-          <wp:extent cx="1781175" cy="219075"/>
-          <wp:effectExtent l="0" t="0" r="0" b="0"/>
-          <wp:docPr id="1" name="Picture 1"/>
-          <wp:cNvGraphicFramePr>
-            <a:graphicFrameLocks xmlns:a="http://schemas.openxmlformats.org/drawingml/2006/main" noChangeAspect="1"/>
-          </wp:cNvGraphicFramePr>
-          <a:graphic xmlns:a="http://schemas.openxmlformats.org/drawingml/2006/main">
-            <a:graphicData uri="http://schemas.openxmlformats.org/drawingml/2006/picture">
-              <pic:pic xmlns:pic="http://schemas.openxmlformats.org/drawingml/2006/picture">
-                <pic:nvPicPr>
-                  <pic:cNvPr id="0" name="Picture 1"/>
-                  <pic:cNvPicPr>
-                    <a:picLocks noChangeAspect="1" noChangeArrowheads="1"/>
-                  </pic:cNvPicPr>
-                </pic:nvPicPr>
-                <pic:blipFill>
-                  <a:blip r:embed="rId1">
-                    <a:extLst>
-                      <a:ext uri="{28A0092B-C50C-407E-A947-70E740481C1C}">
-                        <a14:useLocalDpi xmlns:a14="http://schemas.microsoft.com/office/drawing/2010/main" val="0"/>
-                      </a:ext>
-                    </a:extLst>
-                  </a:blip>
-                  <a:srcRect/>
-                  <a:stretch>
-                    <a:fillRect/>
-                  </a:stretch>
-                </pic:blipFill>
-                <pic:spPr bwMode="auto">
-                  <a:xfrm>
-                    <a:off x="0" y="0"/>
-                    <a:ext cx="1781175" cy="219075"/>
-                  </a:xfrm>
-                  <a:prstGeom prst="rect">
-                    <a:avLst/>
-                  </a:prstGeom>
-                  <a:noFill/>
-                  <a:ln>
-                    <a:noFill/>
-                  </a:ln>
-                </pic:spPr>
-              </pic:pic>
-            </a:graphicData>
-          </a:graphic>
-        </wp:inline>
-      </w:drawing>
-    </w:r>
-  </w:p>
-</w:hdr>
-</file>
-
-<file path=word/header3.xml><?xml version="1.0" encoding="utf-8"?>
-<w:hdr xmlns:wpc="http://schemas.microsoft.com/office/word/2010/wordprocessingCanvas" xmlns:cx="http://schemas.microsoft.com/office/drawing/2014/chartex" xmlns:cx1="http://schemas.microsoft.com/office/drawing/2015/9/8/chartex" xmlns:cx2="http://schemas.microsoft.com/office/drawing/2015/10/21/chartex" xmlns:cx3="http://schemas.microsoft.com/office/drawing/2016/5/9/chartex" xmlns:cx4="http://schemas.microsoft.com/office/drawing/2016/5/10/chartex" xmlns:cx5="http://schemas.microsoft.com/office/drawing/2016/5/11/chartex" xmlns:cx6="http://schemas.microsoft.com/office/drawing/2016/5/12/chartex" xmlns:cx7="http://schemas.microsoft.com/office/drawing/2016/5/13/chartex" xmlns:cx8="http://schemas.microsoft.com/office/drawing/2016/5/14/chartex" xmlns:mc="http://schemas.openxmlformats.org/markup-compatibility/2006" xmlns:aink="http://schemas.microsoft.com/office/drawing/2016/ink" xmlns:am3d="http://schemas.microsoft.com/office/drawing/2017/model3d" xmlns:o="urn:schemas-microsoft-com:office:office" xmlns:oel="http://schemas.microsoft.com/office/2019/extlst" xmlns:r="http://schemas.openxmlformats.org/officeDocument/2006/relationships" xmlns:m="http://schemas.openxmlformats.org/officeDocument/2006/math" xmlns:v="urn:schemas-microsoft-com:vml" xmlns:wp14="http://schemas.microsoft.com/office/word/2010/wordprocessingDrawing" xmlns:wp="http://schemas.openxmlformats.org/drawingml/2006/wordprocessingDrawing" xmlns:w10="urn:schemas-microsoft-com:office:word" xmlns:w="http://schemas.openxmlformats.org/wordprocessingml/2006/main" xmlns:w14="http://schemas.microsoft.com/office/word/2010/wordml" xmlns:w15="http://schemas.microsoft.com/office/word/2012/wordml" xmlns:w16cex="http://schemas.microsoft.com/office/word/2018/wordml/cex" xmlns:w16cid="http://schemas.microsoft.com/office/word/2016/wordml/cid" xmlns:w16="http://schemas.microsoft.com/office/word/2018/wordml" xmlns:w16du="http://schemas.microsoft.com/office/word/2023/wordml/word16du" xmlns:w16sdtdh="http://schemas.microsoft.com/office/word/2020/wordml/sdtdatahash" xmlns:w16sdtfl="http://schemas.microsoft.com/office/word/2024/wordml/sdtformatlock" xmlns:w16se="http://schemas.microsoft.com/office/word/2015/wordml/symex" xmlns:wpg="http://schemas.microsoft.com/office/word/2010/wordprocessingGroup" xmlns:wpi="http://schemas.microsoft.com/office/word/2010/wordprocessingInk" xmlns:wne="http://schemas.microsoft.com/office/word/2006/wordml" xmlns:wps="http://schemas.microsoft.com/office/word/2010/wordprocessingShape" mc:Ignorable="w14 w15 w16se w16cid w16 w16cex w16sdtdh w16sdtfl w16du wp14">
-  <w:p>
-    <w:pPr>
-      <w:pStyle w:val="Header"/>
-    </w:pPr>
-  </w:p>
-</w:hdr>
 </file>
 
 <file path=word/numbering.xml><?xml version="1.0" encoding="utf-8"?>
@@ -5200,14 +5414,12 @@
 </file>
 
 <file path=customXml/item1.xml><?xml version="1.0" encoding="utf-8"?>
-<p:properties xmlns:p="http://schemas.microsoft.com/office/2006/metadata/properties" xmlns:xsi="http://www.w3.org/2001/XMLSchema-instance" xmlns:pc="http://schemas.microsoft.com/office/infopath/2007/PartnerControls">
-  <documentManagement>
-    <TaxCatchAll xmlns="2a1c79aa-5766-4311-93d3-7d903f49c32a"/>
-    <lcf76f155ced4ddcb4097134ff3c332f xmlns="ce418445-29bb-405e-a503-16fecb07c770">
-      <Terms xmlns="http://schemas.microsoft.com/office/infopath/2007/PartnerControls"/>
-    </lcf76f155ced4ddcb4097134ff3c332f>
-  </documentManagement>
-</p:properties>
+<?mso-contentType ?>
+<FormTemplates xmlns="http://schemas.microsoft.com/sharepoint/v3/contenttype/forms">
+  <Display>DocumentLibraryForm</Display>
+  <Edit>DocumentLibraryForm</Edit>
+  <New>DocumentLibraryForm</New>
+</FormTemplates>
 </file>
 
 <file path=customXml/item2.xml><?xml version="1.0" encoding="utf-8"?>
@@ -5472,21 +5684,20 @@
 </file>
 
 <file path=customXml/item3.xml><?xml version="1.0" encoding="utf-8"?>
-<?mso-contentType ?>
-<FormTemplates xmlns="http://schemas.microsoft.com/sharepoint/v3/contenttype/forms">
-  <Display>DocumentLibraryForm</Display>
-  <Edit>DocumentLibraryForm</Edit>
-  <New>DocumentLibraryForm</New>
-</FormTemplates>
+<p:properties xmlns:p="http://schemas.microsoft.com/office/2006/metadata/properties" xmlns:xsi="http://www.w3.org/2001/XMLSchema-instance" xmlns:pc="http://schemas.microsoft.com/office/infopath/2007/PartnerControls">
+  <documentManagement>
+    <TaxCatchAll xmlns="2a1c79aa-5766-4311-93d3-7d903f49c32a"/>
+    <lcf76f155ced4ddcb4097134ff3c332f xmlns="ce418445-29bb-405e-a503-16fecb07c770">
+      <Terms xmlns="http://schemas.microsoft.com/office/infopath/2007/PartnerControls"/>
+    </lcf76f155ced4ddcb4097134ff3c332f>
+  </documentManagement>
+</p:properties>
 </file>
 
 <file path=customXml/itemProps1.xml><?xml version="1.0" encoding="utf-8"?>
-<ds:datastoreItem xmlns:ds="http://schemas.openxmlformats.org/officeDocument/2006/customXml" ds:itemID="{EB4C7DAE-F7BF-44C1-947E-1FEDF1B1951E}">
+<ds:datastoreItem xmlns:ds="http://schemas.openxmlformats.org/officeDocument/2006/customXml" ds:itemID="{1DBD80AC-BB67-427F-8A10-BA3A84FAA580}">
   <ds:schemaRefs>
-    <ds:schemaRef ds:uri="http://schemas.microsoft.com/office/2006/metadata/properties"/>
-    <ds:schemaRef ds:uri="http://schemas.microsoft.com/office/infopath/2007/PartnerControls"/>
-    <ds:schemaRef ds:uri="2a1c79aa-5766-4311-93d3-7d903f49c32a"/>
-    <ds:schemaRef ds:uri="ce418445-29bb-405e-a503-16fecb07c770"/>
+    <ds:schemaRef ds:uri="http://schemas.microsoft.com/sharepoint/v3/contenttype/forms"/>
   </ds:schemaRefs>
 </ds:datastoreItem>
 </file>
@@ -5511,9 +5722,12 @@
 </file>
 
 <file path=customXml/itemProps3.xml><?xml version="1.0" encoding="utf-8"?>
-<ds:datastoreItem xmlns:ds="http://schemas.openxmlformats.org/officeDocument/2006/customXml" ds:itemID="{1DBD80AC-BB67-427F-8A10-BA3A84FAA580}">
+<ds:datastoreItem xmlns:ds="http://schemas.openxmlformats.org/officeDocument/2006/customXml" ds:itemID="{EB4C7DAE-F7BF-44C1-947E-1FEDF1B1951E}">
   <ds:schemaRefs>
-    <ds:schemaRef ds:uri="http://schemas.microsoft.com/sharepoint/v3/contenttype/forms"/>
+    <ds:schemaRef ds:uri="http://schemas.microsoft.com/office/2006/metadata/properties"/>
+    <ds:schemaRef ds:uri="http://schemas.microsoft.com/office/infopath/2007/PartnerControls"/>
+    <ds:schemaRef ds:uri="2a1c79aa-5766-4311-93d3-7d903f49c32a"/>
+    <ds:schemaRef ds:uri="ce418445-29bb-405e-a503-16fecb07c770"/>
   </ds:schemaRefs>
 </ds:datastoreItem>
 </file>
</xml_diff>